<commit_message>
Remove Google Sites gadgets from the MediaMarketplace Studio spec
Co-Authored-By: Claude Fable 5.1 <noreply@anthropic.com>
Claude-Session: https://claude.ai/code/session_01GjP4aQvPNC5gK9soytUbnv
</commit_message>
<xml_diff>
--- a/docs/MediaMarketplace-Studio-Design-Specification.docx
+++ b/docs/MediaMarketplace-Studio-Design-Specification.docx
@@ -30,7 +30,7 @@
         <w:t xml:space="preserve">Version:</w:t>
       </w:r>
       <w:r>
-        <w:t xml:space="preserve"> 2.0 (extension redesign)</w:t>
+        <w:t xml:space="preserve"> 2.1 (extension redesign)</w:t>
       </w:r>
     </w:p>
     <w:p>
@@ -765,22 +765,7 @@
           <w:sz w:val="19"/>
           <w:szCs w:val="19"/>
         </w:rPr>
-        <w:t xml:space="preserve">5.15 Google Sites Gadgets (GG)</w:t>
-      </w:r>
-    </w:p>
-    <w:p>
-      <w:pPr>
-        <w:spacing w:after="30"/>
-        <w:ind w:left="480"/>
-      </w:pPr>
-      <w:r>
-        <w:rPr>
-          <w:b w:val="false"/>
-          <w:bCs w:val="false"/>
-          <w:sz w:val="19"/>
-          <w:szCs w:val="19"/>
-        </w:rPr>
-        <w:t xml:space="preserve">5.16 My Media customer area (AC) [gap: implied by several modules]</w:t>
+        <w:t xml:space="preserve">5.15 My Media customer area (AC) [gap: implied by several modules]</w:t>
       </w:r>
     </w:p>
     <w:p>
@@ -1388,7 +1373,7 @@
         <w:spacing w:after="120" w:line="276"/>
       </w:pPr>
       <w:r>
-        <w:t xml:space="preserve">An extension that turns an existing WooCommerce or VirtueMart store into a marketplace for digital media (video, audio, images, PDFs, live sessions, consultations, gated pages). It adds a visual widget builder and templates for presenting media, a media library with optimisation, ten media product types on top of native products, private pages and site passes with signup workflows, three levels of video watermarking, image protection, copyright scanning, Google Business Profile tooling, and embeddable gadgets for Google Sites.</w:t>
+        <w:t xml:space="preserve">An extension that turns an existing WooCommerce or VirtueMart store into a marketplace for digital media (video, audio, images, PDFs, live sessions, consultations, gated pages). It adds a visual widget builder and templates for presenting media, a media library with optimisation, ten media product types on top of native products, private pages and site passes with signup workflows, three levels of video watermarking, image protection, copyright scanning, and Google Business Profile tooling.</w:t>
       </w:r>
     </w:p>
     <w:p>
@@ -2771,7 +2756,7 @@
           <w:sz w:val="16"/>
           <w:szCs w:val="16"/>
         </w:rPr>
-        <w:t xml:space="preserve">    dist/                          # compiled admin, storefront, embed and player bundles (committed)</w:t>
+        <w:t xml:space="preserve">    dist/                          # compiled admin, storefront and player bundles (committed)</w:t>
       </w:r>
     </w:p>
     <w:p>
@@ -2929,17 +2914,6 @@
           <w:szCs w:val="19"/>
         </w:rPr>
         <w:t xml:space="preserve">/mms-stream/{token}/...</w:t>
-      </w:r>
-      <w:r>
-        <w:t xml:space="preserve">, </w:t>
-      </w:r>
-      <w:r>
-        <w:rPr>
-          <w:rFonts w:ascii="Consolas" w:cs="Consolas" w:eastAsia="Consolas" w:hAnsi="Consolas"/>
-          <w:sz w:val="19"/>
-          <w:szCs w:val="19"/>
-        </w:rPr>
-        <w:t xml:space="preserve">/mms-gadget/{uuid}</w:t>
       </w:r>
       <w:r>
         <w:t xml:space="preserve">, </w:t>
@@ -3166,7 +3140,7 @@
                 <w:sz w:val="18"/>
                 <w:szCs w:val="18"/>
               </w:rPr>
-              <w:t xml:space="preserve">Widgets, widget templates, site templates, private pages, gadgets, watermark templates</w:t>
+              <w:t xml:space="preserve">Widgets, widget templates, site templates, private pages, watermark templates</w:t>
             </w:r>
           </w:p>
         </w:tc>
@@ -3249,21 +3223,6 @@
                 <w:szCs w:val="18"/>
               </w:rPr>
               <w:t xml:space="preserve">mms_page</w:t>
-            </w:r>
-            <w:r>
-              <w:rPr>
-                <w:sz w:val="18"/>
-                <w:szCs w:val="18"/>
-              </w:rPr>
-              <w:t xml:space="preserve">, </w:t>
-            </w:r>
-            <w:r>
-              <w:rPr>
-                <w:rFonts w:ascii="Consolas" w:cs="Consolas" w:eastAsia="Consolas" w:hAnsi="Consolas"/>
-                <w:sz w:val="18"/>
-                <w:szCs w:val="18"/>
-              </w:rPr>
-              <w:t xml:space="preserve">mms_gadget</w:t>
             </w:r>
             <w:r>
               <w:rPr>
@@ -3821,7 +3780,7 @@
         <w:t xml:space="preserve">manage_mms</w:t>
       </w:r>
       <w:r>
-        <w:t xml:space="preserve"> capability) with submenus: Dashboard, Media Library, Widgets, Widget Builder (full-screen), Templates, Site Templates, Products (filtered WooCommerce product list), Showcase, Private Pages, Site Passes, Protection (Image, Watermarks, Copyright), Google, Gadgets, Reports, Settings, Health. Screens use WordPress admin styles, </w:t>
+        <w:t xml:space="preserve"> capability) with submenus: Dashboard, Media Library, Widgets, Widget Builder (full-screen), Templates, Site Templates, Products (filtered WooCommerce product list), Showcase, Private Pages, Site Passes, Protection (Image, Watermarks, Copyright), Google, Reports, Settings, Health. Screens use WordPress admin styles, </w:t>
       </w:r>
       <w:r>
         <w:rPr>
@@ -4078,7 +4037,7 @@
         <w:spacing w:after="60" w:line="276"/>
       </w:pPr>
       <w:r>
-        <w:t xml:space="preserve">Cart: add-to-cart from widgets, showcase and gadgets calls </w:t>
+        <w:t xml:space="preserve">Cart: add-to-cart from widgets and showcases calls </w:t>
       </w:r>
       <w:r>
         <w:rPr>
@@ -4348,7 +4307,7 @@
         <w:spacing w:after="60" w:line="276"/>
       </w:pPr>
       <w:r>
-        <w:t xml:space="preserve">Rewrite endpoints: signed media delivery, per-session HLS, gadget pages, private page gate.</w:t>
+        <w:t xml:space="preserve">Rewrite endpoints: signed media delivery, per-session HLS, private page gate.</w:t>
       </w:r>
     </w:p>
     <w:p>
@@ -4428,7 +4387,7 @@
         <w:t xml:space="preserve">X-WP-Nonce</w:t>
       </w:r>
       <w:r>
-        <w:t xml:space="preserve">); public routes are read-only and token-scoped (gadgets, embed loader); webhooks verify gateway signatures.</w:t>
+        <w:t xml:space="preserve">); public routes are read-only (showcase data, add-to-cart with nonce); webhooks verify gateway signatures.</w:t>
       </w:r>
     </w:p>
     <w:p>
@@ -7286,7 +7245,7 @@
         <w:t xml:space="preserve">MediaMarketplace</w:t>
       </w:r>
       <w:r>
-        <w:t xml:space="preserve"> with submenus: Dashboard, Media, Widgets, Widget Builder, Templates, Site Templates, Products (VirtueMart products with MMS field), Showcase, Private Pages, Site Passes, Protection (Image, Watermarks, Copyright), Google, Gadgets, Reports, Health, Options. Standard Joomla list/edit MVC with toolbar, filters, search, batch actions, check-in/out, ordering, publish states. The builder and template editor are full-screen views using the same compiled bundle as the WordPress admin.</w:t>
+        <w:t xml:space="preserve"> with submenus: Dashboard, Media, Widgets, Widget Builder, Templates, Site Templates, Products (VirtueMart products with MMS field), Showcase, Private Pages, Site Passes, Protection (Image, Watermarks, Copyright), Google, Reports, Health, Options. Standard Joomla list/edit MVC with toolbar, filters, search, batch actions, check-in/out, ordering, publish states. The builder and template editor are full-screen views using the same compiled bundle as the WordPress admin.</w:t>
       </w:r>
     </w:p>
     <w:p>
@@ -7424,8 +7383,8 @@
         </w:tblBorders>
       </w:tblPr>
       <w:tblGrid>
-        <w:gridCol w:w="4680"/>
-        <w:gridCol w:w="4680"/>
+        <w:gridCol w:w="4434"/>
+        <w:gridCol w:w="4926"/>
       </w:tblGrid>
       <w:tr>
         <w:trPr>
@@ -7434,7 +7393,7 @@
         </w:trPr>
         <w:tc>
           <w:tcPr>
-            <w:tcW w:type="dxa" w:w="4680"/>
+            <w:tcW w:type="dxa" w:w="4434"/>
             <w:tcBorders>
               <w:top w:val="single" w:color="BFC7D1" w:sz="4"/>
               <w:left w:val="single" w:color="BFC7D1" w:sz="4"/>
@@ -7467,7 +7426,7 @@
         </w:tc>
         <w:tc>
           <w:tcPr>
-            <w:tcW w:type="dxa" w:w="4680"/>
+            <w:tcW w:type="dxa" w:w="4926"/>
             <w:tcBorders>
               <w:top w:val="single" w:color="BFC7D1" w:sz="4"/>
               <w:left w:val="single" w:color="BFC7D1" w:sz="4"/>
@@ -7506,36 +7465,36 @@
         </w:trPr>
         <w:tc>
           <w:tcPr>
-            <w:tcW w:type="dxa" w:w="4680"/>
-            <w:tcBorders>
-              <w:top w:val="single" w:color="BFC7D1" w:sz="4"/>
-              <w:left w:val="single" w:color="BFC7D1" w:sz="4"/>
-              <w:bottom w:val="single" w:color="BFC7D1" w:sz="4"/>
-              <w:right w:val="single" w:color="BFC7D1" w:sz="4"/>
-            </w:tcBorders>
-            <w:tcMar>
-              <w:top w:type="dxa" w:w="60"/>
-              <w:left w:type="dxa" w:w="90"/>
-              <w:bottom w:type="dxa" w:w="60"/>
-              <w:right w:type="dxa" w:w="90"/>
-            </w:tcMar>
-          </w:tcPr>
-          <w:p>
-            <w:pPr>
-              <w:spacing w:after="0" w:line="252"/>
-            </w:pPr>
-            <w:r>
-              <w:rPr>
-                <w:sz w:val="18"/>
-                <w:szCs w:val="18"/>
-              </w:rPr>
-              <w:t xml:space="preserve">Widgets, templates, private pages, gadgets, watermark templates</w:t>
-            </w:r>
-          </w:p>
-        </w:tc>
-        <w:tc>
-          <w:tcPr>
-            <w:tcW w:type="dxa" w:w="4680"/>
+            <w:tcW w:type="dxa" w:w="4434"/>
+            <w:tcBorders>
+              <w:top w:val="single" w:color="BFC7D1" w:sz="4"/>
+              <w:left w:val="single" w:color="BFC7D1" w:sz="4"/>
+              <w:bottom w:val="single" w:color="BFC7D1" w:sz="4"/>
+              <w:right w:val="single" w:color="BFC7D1" w:sz="4"/>
+            </w:tcBorders>
+            <w:tcMar>
+              <w:top w:type="dxa" w:w="60"/>
+              <w:left w:type="dxa" w:w="90"/>
+              <w:bottom w:type="dxa" w:w="60"/>
+              <w:right w:type="dxa" w:w="90"/>
+            </w:tcMar>
+          </w:tcPr>
+          <w:p>
+            <w:pPr>
+              <w:spacing w:after="0" w:line="252"/>
+            </w:pPr>
+            <w:r>
+              <w:rPr>
+                <w:sz w:val="18"/>
+                <w:szCs w:val="18"/>
+              </w:rPr>
+              <w:t xml:space="preserve">Widgets, templates, private pages, watermark templates</w:t>
+            </w:r>
+          </w:p>
+        </w:tc>
+        <w:tc>
+          <w:tcPr>
+            <w:tcW w:type="dxa" w:w="4926"/>
             <w:tcBorders>
               <w:top w:val="single" w:color="BFC7D1" w:sz="4"/>
               <w:left w:val="single" w:color="BFC7D1" w:sz="4"/>
@@ -7612,21 +7571,6 @@
                 <w:szCs w:val="18"/>
               </w:rPr>
               <w:t xml:space="preserve">#__mms_private_pages</w:t>
-            </w:r>
-            <w:r>
-              <w:rPr>
-                <w:sz w:val="18"/>
-                <w:szCs w:val="18"/>
-              </w:rPr>
-              <w:t xml:space="preserve">, </w:t>
-            </w:r>
-            <w:r>
-              <w:rPr>
-                <w:rFonts w:ascii="Consolas" w:cs="Consolas" w:eastAsia="Consolas" w:hAnsi="Consolas"/>
-                <w:sz w:val="18"/>
-                <w:szCs w:val="18"/>
-              </w:rPr>
-              <w:t xml:space="preserve">#__mms_gadgets</w:t>
             </w:r>
             <w:r>
               <w:rPr>
@@ -7675,7 +7619,7 @@
         </w:trPr>
         <w:tc>
           <w:tcPr>
-            <w:tcW w:type="dxa" w:w="4680"/>
+            <w:tcW w:type="dxa" w:w="4434"/>
             <w:tcBorders>
               <w:top w:val="single" w:color="BFC7D1" w:sz="4"/>
               <w:left w:val="single" w:color="BFC7D1" w:sz="4"/>
@@ -7704,7 +7648,7 @@
         </w:tc>
         <w:tc>
           <w:tcPr>
-            <w:tcW w:type="dxa" w:w="4680"/>
+            <w:tcW w:type="dxa" w:w="4926"/>
             <w:tcBorders>
               <w:top w:val="single" w:color="BFC7D1" w:sz="4"/>
               <w:left w:val="single" w:color="BFC7D1" w:sz="4"/>
@@ -7747,7 +7691,7 @@
         </w:trPr>
         <w:tc>
           <w:tcPr>
-            <w:tcW w:type="dxa" w:w="4680"/>
+            <w:tcW w:type="dxa" w:w="4434"/>
             <w:tcBorders>
               <w:top w:val="single" w:color="BFC7D1" w:sz="4"/>
               <w:left w:val="single" w:color="BFC7D1" w:sz="4"/>
@@ -7776,7 +7720,7 @@
         </w:tc>
         <w:tc>
           <w:tcPr>
-            <w:tcW w:type="dxa" w:w="4680"/>
+            <w:tcW w:type="dxa" w:w="4926"/>
             <w:tcBorders>
               <w:top w:val="single" w:color="BFC7D1" w:sz="4"/>
               <w:left w:val="single" w:color="BFC7D1" w:sz="4"/>
@@ -7856,7 +7800,7 @@
         </w:trPr>
         <w:tc>
           <w:tcPr>
-            <w:tcW w:type="dxa" w:w="4680"/>
+            <w:tcW w:type="dxa" w:w="4434"/>
             <w:tcBorders>
               <w:top w:val="single" w:color="BFC7D1" w:sz="4"/>
               <w:left w:val="single" w:color="BFC7D1" w:sz="4"/>
@@ -7885,7 +7829,7 @@
         </w:tc>
         <w:tc>
           <w:tcPr>
-            <w:tcW w:type="dxa" w:w="4680"/>
+            <w:tcW w:type="dxa" w:w="4926"/>
             <w:tcBorders>
               <w:top w:val="single" w:color="BFC7D1" w:sz="4"/>
               <w:left w:val="single" w:color="BFC7D1" w:sz="4"/>
@@ -7920,7 +7864,7 @@
         </w:trPr>
         <w:tc>
           <w:tcPr>
-            <w:tcW w:type="dxa" w:w="4680"/>
+            <w:tcW w:type="dxa" w:w="4434"/>
             <w:tcBorders>
               <w:top w:val="single" w:color="BFC7D1" w:sz="4"/>
               <w:left w:val="single" w:color="BFC7D1" w:sz="4"/>
@@ -7949,7 +7893,7 @@
         </w:tc>
         <w:tc>
           <w:tcPr>
-            <w:tcW w:type="dxa" w:w="4680"/>
+            <w:tcW w:type="dxa" w:w="4926"/>
             <w:tcBorders>
               <w:top w:val="single" w:color="BFC7D1" w:sz="4"/>
               <w:left w:val="single" w:color="BFC7D1" w:sz="4"/>
@@ -8029,7 +7973,7 @@
         </w:trPr>
         <w:tc>
           <w:tcPr>
-            <w:tcW w:type="dxa" w:w="4680"/>
+            <w:tcW w:type="dxa" w:w="4434"/>
             <w:tcBorders>
               <w:top w:val="single" w:color="BFC7D1" w:sz="4"/>
               <w:left w:val="single" w:color="BFC7D1" w:sz="4"/>
@@ -8058,7 +8002,7 @@
         </w:tc>
         <w:tc>
           <w:tcPr>
-            <w:tcW w:type="dxa" w:w="4680"/>
+            <w:tcW w:type="dxa" w:w="4926"/>
             <w:tcBorders>
               <w:top w:val="single" w:color="BFC7D1" w:sz="4"/>
               <w:left w:val="single" w:color="BFC7D1" w:sz="4"/>
@@ -8192,7 +8136,7 @@
         <w:t xml:space="preserve">Cart and checkout</w:t>
       </w:r>
       <w:r>
-        <w:t xml:space="preserve">: VirtueMart's. Add-to-cart from widgets, showcases and gadgets posts to VirtueMart's cart controller (or its AJAX endpoint) with the custom field value carrying the MMS variant.</w:t>
+        <w:t xml:space="preserve">: VirtueMart's. Add-to-cart from widgets and showcases posts to VirtueMart's cart controller (or its AJAX endpoint) with the custom field value carrying the MMS variant.</w:t>
       </w:r>
     </w:p>
     <w:p>
@@ -8412,7 +8356,7 @@
         <w:spacing w:after="60" w:line="276"/>
       </w:pPr>
       <w:r>
-        <w:t xml:space="preserve">Menu item types: Showcase, Widget, Player (single product), Site Pass Plans, Private Page, My Media, Gadget.</w:t>
+        <w:t xml:space="preserve">Menu item types: Showcase, Widget, Player (single product), Site Pass Plans, Private Page, My Media.</w:t>
       </w:r>
     </w:p>
     <w:p>
@@ -8499,7 +8443,7 @@
         <w:t xml:space="preserve">v1/mms/...</w:t>
       </w:r>
       <w:r>
-        <w:t xml:space="preserve"> mirroring the WordPress REST paths (Appendix C). Authentication through Joomla API tokens for admin routes, public signed tokens for gadgets and embeds, gateway signatures for webhooks.</w:t>
+        <w:t xml:space="preserve"> mirroring the WordPress REST paths (Appendix C). Authentication through Joomla API tokens for admin routes, session token for public write routes, gateway signatures for webhooks.</w:t>
       </w:r>
     </w:p>
     <w:p>
@@ -9360,7 +9304,7 @@
         <w:spacing w:after="120" w:line="276"/>
       </w:pPr>
       <w:r>
-        <w:t xml:space="preserve">Library modules: Media, Widgets, Templates, Products, Players, Access (entitlements, site pass, subscriptions), PrivatePages, Protection (image protection config, watermark engines, copyright service adapters), Google, Gadgets, Ai (Anthropic client), Support (events, jobs, hygiene, ids, clock). Unit tests run the library against fake </w:t>
+        <w:t xml:space="preserve">Library modules: Media, Widgets, Templates, Products, Players, Access (entitlements, site pass, subscriptions), PrivatePages, Protection (image protection config, watermark engines, copyright service adapters), Google, Ai (Anthropic client), Support (events, jobs, hygiene, ids, clock). Unit tests run the library against fake </w:t>
       </w:r>
       <w:r>
         <w:rPr>
@@ -9437,7 +9381,7 @@
         <w:t xml:space="preserve">Purpose.</w:t>
       </w:r>
       <w:r>
-        <w:t xml:space="preserve"> Compose media widgets visually and place them in WordPress, Joomla and Google Sites.</w:t>
+        <w:t xml:space="preserve"> Compose media widgets visually and place them anywhere in the WordPress or Joomla site.</w:t>
       </w:r>
     </w:p>
     <w:p>
@@ -9585,7 +9529,7 @@
         <w:t xml:space="preserve">WB-06</w:t>
       </w:r>
       <w:r>
-        <w:t xml:space="preserve"> Export system: (a) WordPress — shortcode, block and standalone HTML; (b) Joomla — content tag, module assignment and standalone HTML; (c) Google Sites — embed URL and embed code served by this site (§5.15), plus a static HTML fallback. Exported CSS is scoped under </w:t>
+        <w:t xml:space="preserve"> Export system: (a) WordPress — shortcode, block and standalone HTML; (b) Joomla — content tag, module assignment and standalone HTML. Exported CSS is scoped under </w:t>
       </w:r>
       <w:r>
         <w:rPr>
@@ -9670,7 +9614,7 @@
         <w:t xml:space="preserve">WB-09</w:t>
       </w:r>
       <w:r>
-        <w:t xml:space="preserve"> Widget showcase: admin list with search, tags, status, preview thumbnail, duplicate, revisions with restore, usage report (which pages, modules, gadgets).</w:t>
+        <w:t xml:space="preserve"> Widget showcase: admin list with search, tags, status, preview thumbnail, duplicate, revisions with restore, usage report (which pages and modules).</w:t>
       </w:r>
     </w:p>
     <w:p>
@@ -12768,7 +12712,7 @@
         <w:t xml:space="preserve">EC-09</w:t>
       </w:r>
       <w:r>
-        <w:t xml:space="preserve"> Add to Cart from showcase, modal, widget buttons and gadgets goes to the host cart; guest carts, quantity and merge-on-login are the engine's.</w:t>
+        <w:t xml:space="preserve"> Add to Cart from showcase, modal and widget buttons goes to the host cart; guest carts, quantity and merge-on-login are the engine's.</w:t>
       </w:r>
     </w:p>
     <w:p>
@@ -16718,357 +16662,7 @@
         <w:spacing w:after="120" w:before="240"/>
       </w:pPr>
       <w:r>
-        <w:t xml:space="preserve">5.15 Google Sites Gadgets (</w:t>
-      </w:r>
-      <w:r>
-        <w:rPr>
-          <w:rFonts w:ascii="Consolas" w:cs="Consolas" w:eastAsia="Consolas" w:hAnsi="Consolas"/>
-          <w:sz w:val="19"/>
-          <w:szCs w:val="19"/>
-        </w:rPr>
-        <w:t xml:space="preserve">GG</w:t>
-      </w:r>
-      <w:r>
-        <w:t xml:space="preserve">)</w:t>
-      </w:r>
-    </w:p>
-    <w:p>
-      <w:pPr>
-        <w:spacing w:after="120" w:line="276"/>
-      </w:pPr>
-      <w:r>
-        <w:t xml:space="preserve">Gadgets are pages </w:t>
-      </w:r>
-      <w:r>
-        <w:rPr>
-          <w:b/>
-          <w:bCs/>
-        </w:rPr>
-        <w:t xml:space="preserve">served by the extension on the merchant's site</w:t>
-      </w:r>
-      <w:r>
-        <w:t xml:space="preserve"> and embedded in Google Sites through </w:t>
-      </w:r>
-      <w:r>
-        <w:rPr>
-          <w:i/>
-          <w:iCs/>
-        </w:rPr>
-        <w:t xml:space="preserve">Insert → Embed → By URL</w:t>
-      </w:r>
-      <w:r>
-        <w:t xml:space="preserve"> (iframe). The extension also emits a classic-Sites XML gadget descriptor pointing at the same URL </w:t>
-      </w:r>
-      <w:r>
-        <w:rPr>
-          <w:b/>
-          <w:bCs/>
-        </w:rPr>
-        <w:t xml:space="preserve">[assumption]</w:t>
-      </w:r>
-      <w:r>
-        <w:t xml:space="preserve">.</w:t>
-      </w:r>
-    </w:p>
-    <w:p>
-      <w:pPr>
-        <w:pStyle w:val="ListParagraph"/>
-        <w:numPr>
-          <w:ilvl w:val="0"/>
-          <w:numId w:val="3"/>
-        </w:numPr>
-        <w:spacing w:after="60" w:line="276"/>
-      </w:pPr>
-      <w:r>
-        <w:rPr>
-          <w:rFonts w:ascii="Consolas" w:cs="Consolas" w:eastAsia="Consolas" w:hAnsi="Consolas"/>
-          <w:sz w:val="19"/>
-          <w:szCs w:val="19"/>
-        </w:rPr>
-        <w:t xml:space="preserve">GG-01</w:t>
-      </w:r>
-      <w:r>
-        <w:t xml:space="preserve"> Single Product Gadget. </w:t>
-      </w:r>
-      <w:r>
-        <w:rPr>
-          <w:rFonts w:ascii="Consolas" w:cs="Consolas" w:eastAsia="Consolas" w:hAnsi="Consolas"/>
-          <w:sz w:val="19"/>
-          <w:szCs w:val="19"/>
-        </w:rPr>
-        <w:t xml:space="preserve">GG-02</w:t>
-      </w:r>
-      <w:r>
-        <w:t xml:space="preserve"> Multiple Products Gadget (chosen products or a category; grid/list). </w:t>
-      </w:r>
-      <w:r>
-        <w:rPr>
-          <w:rFonts w:ascii="Consolas" w:cs="Consolas" w:eastAsia="Consolas" w:hAnsi="Consolas"/>
-          <w:sz w:val="19"/>
-          <w:szCs w:val="19"/>
-        </w:rPr>
-        <w:t xml:space="preserve">GG-03</w:t>
-      </w:r>
-      <w:r>
-        <w:t xml:space="preserve"> Category Showcase (tabs). </w:t>
-      </w:r>
-      <w:r>
-        <w:rPr>
-          <w:rFonts w:ascii="Consolas" w:cs="Consolas" w:eastAsia="Consolas" w:hAnsi="Consolas"/>
-          <w:sz w:val="19"/>
-          <w:szCs w:val="19"/>
-        </w:rPr>
-        <w:t xml:space="preserve">GG-04</w:t>
-      </w:r>
-      <w:r>
-        <w:t xml:space="preserve"> Search Integration.</w:t>
-      </w:r>
-    </w:p>
-    <w:p>
-      <w:pPr>
-        <w:pStyle w:val="ListParagraph"/>
-        <w:numPr>
-          <w:ilvl w:val="0"/>
-          <w:numId w:val="3"/>
-        </w:numPr>
-        <w:spacing w:after="60" w:line="276"/>
-      </w:pPr>
-      <w:r>
-        <w:rPr>
-          <w:rFonts w:ascii="Consolas" w:cs="Consolas" w:eastAsia="Consolas" w:hAnsi="Consolas"/>
-          <w:sz w:val="19"/>
-          <w:szCs w:val="19"/>
-        </w:rPr>
-        <w:t xml:space="preserve">GG-05</w:t>
-      </w:r>
-      <w:r>
-        <w:t xml:space="preserve"> Responsive gadget </w:t>
-      </w:r>
-      <w:r>
-        <w:rPr>
-          <w:b/>
-          <w:bCs/>
-        </w:rPr>
-        <w:t xml:space="preserve">[gap: source list truncated here]</w:t>
-      </w:r>
-      <w:r>
-        <w:t xml:space="preserve">: reports its height via </w:t>
-      </w:r>
-      <w:r>
-        <w:rPr>
-          <w:rFonts w:ascii="Consolas" w:cs="Consolas" w:eastAsia="Consolas" w:hAnsi="Consolas"/>
-          <w:sz w:val="19"/>
-          <w:szCs w:val="19"/>
-        </w:rPr>
-        <w:t xml:space="preserve">postMessage</w:t>
-      </w:r>
-      <w:r>
-        <w:t xml:space="preserve">; mobile layout ≤ 640 px.</w:t>
-      </w:r>
-    </w:p>
-    <w:p>
-      <w:pPr>
-        <w:pStyle w:val="ListParagraph"/>
-        <w:numPr>
-          <w:ilvl w:val="0"/>
-          <w:numId w:val="3"/>
-        </w:numPr>
-        <w:spacing w:after="60" w:line="276"/>
-      </w:pPr>
-      <w:r>
-        <w:rPr>
-          <w:rFonts w:ascii="Consolas" w:cs="Consolas" w:eastAsia="Consolas" w:hAnsi="Consolas"/>
-          <w:sz w:val="19"/>
-          <w:szCs w:val="19"/>
-        </w:rPr>
-        <w:t xml:space="preserve">GG-06</w:t>
-      </w:r>
-      <w:r>
-        <w:t xml:space="preserve"> Cart handoff gadget </w:t>
-      </w:r>
-      <w:r>
-        <w:rPr>
-          <w:b/>
-          <w:bCs/>
-        </w:rPr>
-        <w:t xml:space="preserve">[gap]</w:t>
-      </w:r>
-      <w:r>
-        <w:t xml:space="preserve">: mini-cart that sends the visitor to the host checkout on the merchant's site.</w:t>
-      </w:r>
-    </w:p>
-    <w:p>
-      <w:pPr>
-        <w:pStyle w:val="ListParagraph"/>
-        <w:numPr>
-          <w:ilvl w:val="0"/>
-          <w:numId w:val="3"/>
-        </w:numPr>
-        <w:spacing w:after="60" w:line="276"/>
-      </w:pPr>
-      <w:r>
-        <w:rPr>
-          <w:rFonts w:ascii="Consolas" w:cs="Consolas" w:eastAsia="Consolas" w:hAnsi="Consolas"/>
-          <w:sz w:val="19"/>
-          <w:szCs w:val="19"/>
-        </w:rPr>
-        <w:t xml:space="preserve">GG-07</w:t>
-      </w:r>
-      <w:r>
-        <w:t xml:space="preserve"> Site Pass gadget </w:t>
-      </w:r>
-      <w:r>
-        <w:rPr>
-          <w:b/>
-          <w:bCs/>
-        </w:rPr>
-        <w:t xml:space="preserve">[gap]</w:t>
-      </w:r>
-      <w:r>
-        <w:t xml:space="preserve">: plans and purchase CTA.</w:t>
-      </w:r>
-    </w:p>
-    <w:p>
-      <w:pPr>
-        <w:pStyle w:val="ListParagraph"/>
-        <w:numPr>
-          <w:ilvl w:val="0"/>
-          <w:numId w:val="3"/>
-        </w:numPr>
-        <w:spacing w:after="60" w:line="276"/>
-      </w:pPr>
-      <w:r>
-        <w:rPr>
-          <w:rFonts w:ascii="Consolas" w:cs="Consolas" w:eastAsia="Consolas" w:hAnsi="Consolas"/>
-          <w:sz w:val="19"/>
-          <w:szCs w:val="19"/>
-        </w:rPr>
-        <w:t xml:space="preserve">GG-08</w:t>
-      </w:r>
-      <w:r>
-        <w:t xml:space="preserve"> Gadget builder in admin: pick type, configure, choose template/theme, copy embed URL and code; each gadget has a public read-only token.</w:t>
-      </w:r>
-    </w:p>
-    <w:p>
-      <w:pPr>
-        <w:pStyle w:val="ListParagraph"/>
-        <w:numPr>
-          <w:ilvl w:val="0"/>
-          <w:numId w:val="3"/>
-        </w:numPr>
-        <w:spacing w:after="60" w:line="276"/>
-      </w:pPr>
-      <w:r>
-        <w:rPr>
-          <w:rFonts w:ascii="Consolas" w:cs="Consolas" w:eastAsia="Consolas" w:hAnsi="Consolas"/>
-          <w:sz w:val="19"/>
-          <w:szCs w:val="19"/>
-        </w:rPr>
-        <w:t xml:space="preserve">GG-09</w:t>
-      </w:r>
-      <w:r>
-        <w:t xml:space="preserve"> Gadgets apply image protection and Level 1/2 watermarks; Level 3 playlists use the same signed routes.</w:t>
-      </w:r>
-    </w:p>
-    <w:p>
-      <w:pPr>
-        <w:pStyle w:val="ListParagraph"/>
-        <w:numPr>
-          <w:ilvl w:val="0"/>
-          <w:numId w:val="3"/>
-        </w:numPr>
-        <w:spacing w:after="60" w:line="276"/>
-      </w:pPr>
-      <w:r>
-        <w:rPr>
-          <w:rFonts w:ascii="Consolas" w:cs="Consolas" w:eastAsia="Consolas" w:hAnsi="Consolas"/>
-          <w:sz w:val="19"/>
-          <w:szCs w:val="19"/>
-        </w:rPr>
-        <w:t xml:space="preserve">GG-10</w:t>
-      </w:r>
-      <w:r>
-        <w:t xml:space="preserve"> Gadget responses send </w:t>
-      </w:r>
-      <w:r>
-        <w:rPr>
-          <w:rFonts w:ascii="Consolas" w:cs="Consolas" w:eastAsia="Consolas" w:hAnsi="Consolas"/>
-          <w:sz w:val="19"/>
-          <w:szCs w:val="19"/>
-        </w:rPr>
-        <w:t xml:space="preserve">Content-Security-Policy: frame-ancestors</w:t>
-      </w:r>
-      <w:r>
-        <w:t xml:space="preserve"> allowing </w:t>
-      </w:r>
-      <w:r>
-        <w:rPr>
-          <w:rFonts w:ascii="Consolas" w:cs="Consolas" w:eastAsia="Consolas" w:hAnsi="Consolas"/>
-          <w:sz w:val="19"/>
-          <w:szCs w:val="19"/>
-        </w:rPr>
-        <w:t xml:space="preserve">sites.google.com</w:t>
-      </w:r>
-      <w:r>
-        <w:t xml:space="preserve">, </w:t>
-      </w:r>
-      <w:r>
-        <w:rPr>
-          <w:rFonts w:ascii="Consolas" w:cs="Consolas" w:eastAsia="Consolas" w:hAnsi="Consolas"/>
-          <w:sz w:val="19"/>
-          <w:szCs w:val="19"/>
-        </w:rPr>
-        <w:t xml:space="preserve">*.googleusercontent.com</w:t>
-      </w:r>
-      <w:r>
-        <w:t xml:space="preserve"> and admin-configured origins.</w:t>
-      </w:r>
-    </w:p>
-    <w:p>
-      <w:pPr>
-        <w:spacing w:after="120" w:line="276"/>
-      </w:pPr>
-      <w:r>
-        <w:rPr>
-          <w:b/>
-          <w:bCs/>
-        </w:rPr>
-        <w:t xml:space="preserve">Routes.</w:t>
-      </w:r>
-      <w:r>
-        <w:t xml:space="preserve"> WP: rewrite </w:t>
-      </w:r>
-      <w:r>
-        <w:rPr>
-          <w:rFonts w:ascii="Consolas" w:cs="Consolas" w:eastAsia="Consolas" w:hAnsi="Consolas"/>
-          <w:sz w:val="19"/>
-          <w:szCs w:val="19"/>
-        </w:rPr>
-        <w:t xml:space="preserve">/mms-gadget/{uuid}</w:t>
-      </w:r>
-      <w:r>
-        <w:t xml:space="preserve">. Joomla: component view </w:t>
-      </w:r>
-      <w:r>
-        <w:rPr>
-          <w:rFonts w:ascii="Consolas" w:cs="Consolas" w:eastAsia="Consolas" w:hAnsi="Consolas"/>
-          <w:sz w:val="19"/>
-          <w:szCs w:val="19"/>
-        </w:rPr>
-        <w:t xml:space="preserve">gadget</w:t>
-      </w:r>
-      <w:r>
-        <w:t xml:space="preserve"> with SEF route and a Gadget menu item type.</w:t>
-      </w:r>
-    </w:p>
-    <w:p>
-      <w:pPr>
-        <w:pStyle w:val="Heading2"/>
-        <w:keepNext/>
-        <w:spacing w:after="120" w:before="240"/>
-      </w:pPr>
-      <w:r>
-        <w:t xml:space="preserve">5.16 My Media customer area (</w:t>
+        <w:t xml:space="preserve">5.15 My Media customer area (</w:t>
       </w:r>
       <w:r>
         <w:rPr>
@@ -18496,14 +18090,7 @@
                 <w:sz w:val="18"/>
                 <w:szCs w:val="18"/>
               </w:rPr>
-              <w:t xml:space="preserve">mms_gadgets</w:t>
-            </w:r>
-            <w:r>
-              <w:rPr>
-                <w:sz w:val="18"/>
-                <w:szCs w:val="18"/>
-              </w:rPr>
-              <w:t xml:space="preserve"> (Joomla only)</w:t>
+              <w:t xml:space="preserve">mms_audit_log</w:t>
             </w:r>
           </w:p>
         </w:tc>
@@ -18532,7 +18119,7 @@
                 <w:sz w:val="18"/>
                 <w:szCs w:val="18"/>
               </w:rPr>
-              <w:t xml:space="preserve">gadget config and public token</w:t>
+              <w:t xml:space="preserve">actor, action, subject, ip, ua, details, at</w:t>
             </w:r>
           </w:p>
         </w:tc>
@@ -18568,7 +18155,7 @@
                 <w:sz w:val="18"/>
                 <w:szCs w:val="18"/>
               </w:rPr>
-              <w:t xml:space="preserve">mms_audit_log</w:t>
+              <w:t xml:space="preserve">mms_jobs</w:t>
             </w:r>
           </w:p>
         </w:tc>
@@ -18597,7 +18184,7 @@
                 <w:sz w:val="18"/>
                 <w:szCs w:val="18"/>
               </w:rPr>
-              <w:t xml:space="preserve">actor, action, subject, ip, ua, details, at</w:t>
+              <w:t xml:space="preserve">type, args, status, attempts, last error, run at (mirror of scheduler state for the Health page)</w:t>
             </w:r>
           </w:p>
         </w:tc>
@@ -18633,7 +18220,14 @@
                 <w:sz w:val="18"/>
                 <w:szCs w:val="18"/>
               </w:rPr>
-              <w:t xml:space="preserve">mms_jobs</w:t>
+              <w:t xml:space="preserve">mms_settings</w:t>
+            </w:r>
+            <w:r>
+              <w:rPr>
+                <w:sz w:val="18"/>
+                <w:szCs w:val="18"/>
+              </w:rPr>
+              <w:t xml:space="preserve"> (Joomla only)</w:t>
             </w:r>
           </w:p>
         </w:tc>
@@ -18662,7 +18256,7 @@
                 <w:sz w:val="18"/>
                 <w:szCs w:val="18"/>
               </w:rPr>
-              <w:t xml:space="preserve">type, args, status, attempts, last error, run at (mirror of scheduler state for the Health page)</w:t>
+              <w:t xml:space="preserve">encrypted secrets</w:t>
             </w:r>
           </w:p>
         </w:tc>
@@ -18698,78 +18292,6 @@
                 <w:sz w:val="18"/>
                 <w:szCs w:val="18"/>
               </w:rPr>
-              <w:t xml:space="preserve">mms_settings</w:t>
-            </w:r>
-            <w:r>
-              <w:rPr>
-                <w:sz w:val="18"/>
-                <w:szCs w:val="18"/>
-              </w:rPr>
-              <w:t xml:space="preserve"> (Joomla only)</w:t>
-            </w:r>
-          </w:p>
-        </w:tc>
-        <w:tc>
-          <w:tcPr>
-            <w:tcW w:type="dxa" w:w="4680"/>
-            <w:tcBorders>
-              <w:top w:val="single" w:color="BFC7D1" w:sz="4"/>
-              <w:left w:val="single" w:color="BFC7D1" w:sz="4"/>
-              <w:bottom w:val="single" w:color="BFC7D1" w:sz="4"/>
-              <w:right w:val="single" w:color="BFC7D1" w:sz="4"/>
-            </w:tcBorders>
-            <w:tcMar>
-              <w:top w:type="dxa" w:w="60"/>
-              <w:left w:type="dxa" w:w="90"/>
-              <w:bottom w:type="dxa" w:w="60"/>
-              <w:right w:type="dxa" w:w="90"/>
-            </w:tcMar>
-          </w:tcPr>
-          <w:p>
-            <w:pPr>
-              <w:spacing w:after="0" w:line="252"/>
-            </w:pPr>
-            <w:r>
-              <w:rPr>
-                <w:sz w:val="18"/>
-                <w:szCs w:val="18"/>
-              </w:rPr>
-              <w:t xml:space="preserve">encrypted secrets</w:t>
-            </w:r>
-          </w:p>
-        </w:tc>
-      </w:tr>
-      <w:tr>
-        <w:trPr>
-          <w:cantSplit/>
-          <w:tblHeader w:val="false"/>
-        </w:trPr>
-        <w:tc>
-          <w:tcPr>
-            <w:tcW w:type="dxa" w:w="4680"/>
-            <w:tcBorders>
-              <w:top w:val="single" w:color="BFC7D1" w:sz="4"/>
-              <w:left w:val="single" w:color="BFC7D1" w:sz="4"/>
-              <w:bottom w:val="single" w:color="BFC7D1" w:sz="4"/>
-              <w:right w:val="single" w:color="BFC7D1" w:sz="4"/>
-            </w:tcBorders>
-            <w:tcMar>
-              <w:top w:type="dxa" w:w="60"/>
-              <w:left w:type="dxa" w:w="90"/>
-              <w:bottom w:type="dxa" w:w="60"/>
-              <w:right w:type="dxa" w:w="90"/>
-            </w:tcMar>
-          </w:tcPr>
-          <w:p>
-            <w:pPr>
-              <w:spacing w:after="0" w:line="252"/>
-            </w:pPr>
-            <w:r>
-              <w:rPr>
-                <w:rFonts w:ascii="Consolas" w:cs="Consolas" w:eastAsia="Consolas" w:hAnsi="Consolas"/>
-                <w:sz w:val="18"/>
-                <w:szCs w:val="18"/>
-              </w:rPr>
               <w:t xml:space="preserve">mms_schema_version</w:t>
             </w:r>
           </w:p>
@@ -18926,7 +18448,7 @@
         <w:spacing w:after="60" w:line="276"/>
       </w:pPr>
       <w:r>
-        <w:t xml:space="preserve">Rate limiting on gate attempts, playback session creation and gadget routes.</w:t>
+        <w:t xml:space="preserve">Rate limiting on gate attempts and playback session creation.</w:t>
       </w:r>
     </w:p>
     <w:p>
@@ -22179,7 +21701,7 @@
                 <w:sz w:val="18"/>
                 <w:szCs w:val="18"/>
               </w:rPr>
-              <w:t xml:space="preserve">a widget exported to WP, Joomla and Google Sites renders identically</w:t>
+              <w:t xml:space="preserve">a widget exported to WP and Joomla renders identically</w:t>
             </w:r>
           </w:p>
         </w:tc>
@@ -22530,7 +22052,7 @@
                 <w:sz w:val="18"/>
                 <w:szCs w:val="18"/>
               </w:rPr>
-              <w:t xml:space="preserve">GM (Business Profile + AI), GG gadgets</w:t>
+              <w:t xml:space="preserve">GM (Business Profile + AI)</w:t>
             </w:r>
           </w:p>
         </w:tc>
@@ -22559,7 +22081,7 @@
                 <w:sz w:val="18"/>
                 <w:szCs w:val="18"/>
               </w:rPr>
-              <w:t xml:space="preserve">post scheduled and published; gadget renders in Google Sites</w:t>
+              <w:t xml:space="preserve">post scheduled and published; AI review reply drafted and approved</w:t>
             </w:r>
           </w:p>
         </w:tc>
@@ -23041,29 +22563,7 @@
         <w:spacing w:after="120" w:line="276"/>
       </w:pPr>
       <w:r>
-        <w:t xml:space="preserve">Gaps completed from the truncated source list: </w:t>
-      </w:r>
-      <w:r>
-        <w:rPr>
-          <w:rFonts w:ascii="Consolas" w:cs="Consolas" w:eastAsia="Consolas" w:hAnsi="Consolas"/>
-          <w:sz w:val="19"/>
-          <w:szCs w:val="19"/>
-        </w:rPr>
-        <w:t xml:space="preserve">GG-05</w:t>
-      </w:r>
-      <w:r>
-        <w:t xml:space="preserve"> to </w:t>
-      </w:r>
-      <w:r>
-        <w:rPr>
-          <w:rFonts w:ascii="Consolas" w:cs="Consolas" w:eastAsia="Consolas" w:hAnsi="Consolas"/>
-          <w:sz w:val="19"/>
-          <w:szCs w:val="19"/>
-        </w:rPr>
-        <w:t xml:space="preserve">GG-07</w:t>
-      </w:r>
-      <w:r>
-        <w:t xml:space="preserve">; the My Media customer area (</w:t>
+        <w:t xml:space="preserve">Gaps completed from the source list: the My Media customer area (</w:t>
       </w:r>
       <w:r>
         <w:rPr>
@@ -23360,26 +22860,6 @@
       </w:r>
       <w:r>
         <w:t xml:space="preserve"> — two imperceptibly different encodings of an HLS segment used to encode a per-session bit sequence.</w:t>
-      </w:r>
-    </w:p>
-    <w:p>
-      <w:pPr>
-        <w:pStyle w:val="ListParagraph"/>
-        <w:numPr>
-          <w:ilvl w:val="0"/>
-          <w:numId w:val="3"/>
-        </w:numPr>
-        <w:spacing w:after="60" w:line="276"/>
-      </w:pPr>
-      <w:r>
-        <w:rPr>
-          <w:b/>
-          <w:bCs/>
-        </w:rPr>
-        <w:t xml:space="preserve">Gadget</w:t>
-      </w:r>
-      <w:r>
-        <w:t xml:space="preserve"> — a page served by the extension for embedding in Google Sites.</w:t>
       </w:r>
     </w:p>
     <w:p>
@@ -25802,130 +25282,6 @@
                 <w:sz w:val="18"/>
                 <w:szCs w:val="18"/>
               </w:rPr>
-              <w:t xml:space="preserve">Gadgets</w:t>
-            </w:r>
-          </w:p>
-        </w:tc>
-        <w:tc>
-          <w:tcPr>
-            <w:tcW w:type="dxa" w:w="4223"/>
-            <w:tcBorders>
-              <w:top w:val="single" w:color="BFC7D1" w:sz="4"/>
-              <w:left w:val="single" w:color="BFC7D1" w:sz="4"/>
-              <w:bottom w:val="single" w:color="BFC7D1" w:sz="4"/>
-              <w:right w:val="single" w:color="BFC7D1" w:sz="4"/>
-            </w:tcBorders>
-            <w:tcMar>
-              <w:top w:type="dxa" w:w="60"/>
-              <w:left w:type="dxa" w:w="90"/>
-              <w:bottom w:type="dxa" w:w="60"/>
-              <w:right w:type="dxa" w:w="90"/>
-            </w:tcMar>
-          </w:tcPr>
-          <w:p>
-            <w:pPr>
-              <w:spacing w:after="0" w:line="252"/>
-            </w:pPr>
-            <w:r>
-              <w:rPr>
-                <w:rFonts w:ascii="Consolas" w:cs="Consolas" w:eastAsia="Consolas" w:hAnsi="Consolas"/>
-                <w:sz w:val="18"/>
-                <w:szCs w:val="18"/>
-              </w:rPr>
-              <w:t xml:space="preserve">mms_gadget</w:t>
-            </w:r>
-            <w:r>
-              <w:rPr>
-                <w:sz w:val="18"/>
-                <w:szCs w:val="18"/>
-              </w:rPr>
-              <w:t xml:space="preserve"> post type, </w:t>
-            </w:r>
-            <w:r>
-              <w:rPr>
-                <w:rFonts w:ascii="Consolas" w:cs="Consolas" w:eastAsia="Consolas" w:hAnsi="Consolas"/>
-                <w:sz w:val="18"/>
-                <w:szCs w:val="18"/>
-              </w:rPr>
-              <w:t xml:space="preserve">/mms-gadget/{uuid}</w:t>
-            </w:r>
-            <w:r>
-              <w:rPr>
-                <w:sz w:val="18"/>
-                <w:szCs w:val="18"/>
-              </w:rPr>
-              <w:t xml:space="preserve"> rewrite</w:t>
-            </w:r>
-          </w:p>
-        </w:tc>
-        <w:tc>
-          <w:tcPr>
-            <w:tcW w:type="dxa" w:w="4222"/>
-            <w:tcBorders>
-              <w:top w:val="single" w:color="BFC7D1" w:sz="4"/>
-              <w:left w:val="single" w:color="BFC7D1" w:sz="4"/>
-              <w:bottom w:val="single" w:color="BFC7D1" w:sz="4"/>
-              <w:right w:val="single" w:color="BFC7D1" w:sz="4"/>
-            </w:tcBorders>
-            <w:tcMar>
-              <w:top w:type="dxa" w:w="60"/>
-              <w:left w:type="dxa" w:w="90"/>
-              <w:bottom w:type="dxa" w:w="60"/>
-              <w:right w:type="dxa" w:w="90"/>
-            </w:tcMar>
-          </w:tcPr>
-          <w:p>
-            <w:pPr>
-              <w:spacing w:after="0" w:line="252"/>
-            </w:pPr>
-            <w:r>
-              <w:rPr>
-                <w:rFonts w:ascii="Consolas" w:cs="Consolas" w:eastAsia="Consolas" w:hAnsi="Consolas"/>
-                <w:sz w:val="18"/>
-                <w:szCs w:val="18"/>
-              </w:rPr>
-              <w:t xml:space="preserve">#__mms_gadgets</w:t>
-            </w:r>
-            <w:r>
-              <w:rPr>
-                <w:sz w:val="18"/>
-                <w:szCs w:val="18"/>
-              </w:rPr>
-              <w:t xml:space="preserve">, Gadget view and menu item</w:t>
-            </w:r>
-          </w:p>
-        </w:tc>
-      </w:tr>
-      <w:tr>
-        <w:trPr>
-          <w:cantSplit/>
-          <w:tblHeader w:val="false"/>
-        </w:trPr>
-        <w:tc>
-          <w:tcPr>
-            <w:tcW w:type="dxa" w:w="915"/>
-            <w:tcBorders>
-              <w:top w:val="single" w:color="BFC7D1" w:sz="4"/>
-              <w:left w:val="single" w:color="BFC7D1" w:sz="4"/>
-              <w:bottom w:val="single" w:color="BFC7D1" w:sz="4"/>
-              <w:right w:val="single" w:color="BFC7D1" w:sz="4"/>
-            </w:tcBorders>
-            <w:tcMar>
-              <w:top w:type="dxa" w:w="60"/>
-              <w:left w:type="dxa" w:w="90"/>
-              <w:bottom w:type="dxa" w:w="60"/>
-              <w:right w:type="dxa" w:w="90"/>
-            </w:tcMar>
-          </w:tcPr>
-          <w:p>
-            <w:pPr>
-              <w:spacing w:after="0" w:line="252"/>
-            </w:pPr>
-            <w:r>
-              <w:rPr>
-                <w:sz w:val="18"/>
-                <w:szCs w:val="18"/>
-              </w:rPr>
               <w:t xml:space="preserve">Settings</w:t>
             </w:r>
           </w:p>
@@ -26157,10 +25513,10 @@
         </w:tblBorders>
       </w:tblPr>
       <w:tblGrid>
-        <w:gridCol w:w="1358"/>
-        <w:gridCol w:w="4287"/>
-        <w:gridCol w:w="1000"/>
-        <w:gridCol w:w="2715"/>
+        <w:gridCol w:w="1279"/>
+        <w:gridCol w:w="4040"/>
+        <w:gridCol w:w="1481"/>
+        <w:gridCol w:w="2560"/>
       </w:tblGrid>
       <w:tr>
         <w:trPr>
@@ -26169,7 +25525,7 @@
         </w:trPr>
         <w:tc>
           <w:tcPr>
-            <w:tcW w:type="dxa" w:w="1358"/>
+            <w:tcW w:type="dxa" w:w="1279"/>
             <w:tcBorders>
               <w:top w:val="single" w:color="BFC7D1" w:sz="4"/>
               <w:left w:val="single" w:color="BFC7D1" w:sz="4"/>
@@ -26202,7 +25558,7 @@
         </w:tc>
         <w:tc>
           <w:tcPr>
-            <w:tcW w:type="dxa" w:w="4287"/>
+            <w:tcW w:type="dxa" w:w="4040"/>
             <w:tcBorders>
               <w:top w:val="single" w:color="BFC7D1" w:sz="4"/>
               <w:left w:val="single" w:color="BFC7D1" w:sz="4"/>
@@ -26235,7 +25591,7 @@
         </w:tc>
         <w:tc>
           <w:tcPr>
-            <w:tcW w:type="dxa" w:w="1000"/>
+            <w:tcW w:type="dxa" w:w="1481"/>
             <w:tcBorders>
               <w:top w:val="single" w:color="BFC7D1" w:sz="4"/>
               <w:left w:val="single" w:color="BFC7D1" w:sz="4"/>
@@ -26268,7 +25624,7 @@
         </w:tc>
         <w:tc>
           <w:tcPr>
-            <w:tcW w:type="dxa" w:w="2715"/>
+            <w:tcW w:type="dxa" w:w="2560"/>
             <w:tcBorders>
               <w:top w:val="single" w:color="BFC7D1" w:sz="4"/>
               <w:left w:val="single" w:color="BFC7D1" w:sz="4"/>
@@ -26307,7 +25663,7 @@
         </w:trPr>
         <w:tc>
           <w:tcPr>
-            <w:tcW w:type="dxa" w:w="1358"/>
+            <w:tcW w:type="dxa" w:w="1279"/>
             <w:tcBorders>
               <w:top w:val="single" w:color="BFC7D1" w:sz="4"/>
               <w:left w:val="single" w:color="BFC7D1" w:sz="4"/>
@@ -26336,7 +25692,7 @@
         </w:tc>
         <w:tc>
           <w:tcPr>
-            <w:tcW w:type="dxa" w:w="4287"/>
+            <w:tcW w:type="dxa" w:w="4040"/>
             <w:tcBorders>
               <w:top w:val="single" w:color="BFC7D1" w:sz="4"/>
               <w:left w:val="single" w:color="BFC7D1" w:sz="4"/>
@@ -26396,7 +25752,7 @@
         </w:tc>
         <w:tc>
           <w:tcPr>
-            <w:tcW w:type="dxa" w:w="1000"/>
+            <w:tcW w:type="dxa" w:w="1481"/>
             <w:tcBorders>
               <w:top w:val="single" w:color="BFC7D1" w:sz="4"/>
               <w:left w:val="single" w:color="BFC7D1" w:sz="4"/>
@@ -26425,7 +25781,7 @@
         </w:tc>
         <w:tc>
           <w:tcPr>
-            <w:tcW w:type="dxa" w:w="2715"/>
+            <w:tcW w:type="dxa" w:w="2560"/>
             <w:tcBorders>
               <w:top w:val="single" w:color="BFC7D1" w:sz="4"/>
               <w:left w:val="single" w:color="BFC7D1" w:sz="4"/>
@@ -26460,7 +25816,7 @@
         </w:trPr>
         <w:tc>
           <w:tcPr>
-            <w:tcW w:type="dxa" w:w="1358"/>
+            <w:tcW w:type="dxa" w:w="1279"/>
             <w:tcBorders>
               <w:top w:val="single" w:color="BFC7D1" w:sz="4"/>
               <w:left w:val="single" w:color="BFC7D1" w:sz="4"/>
@@ -26489,7 +25845,7 @@
         </w:tc>
         <w:tc>
           <w:tcPr>
-            <w:tcW w:type="dxa" w:w="4287"/>
+            <w:tcW w:type="dxa" w:w="4040"/>
             <w:tcBorders>
               <w:top w:val="single" w:color="BFC7D1" w:sz="4"/>
               <w:left w:val="single" w:color="BFC7D1" w:sz="4"/>
@@ -26534,7 +25890,7 @@
         </w:tc>
         <w:tc>
           <w:tcPr>
-            <w:tcW w:type="dxa" w:w="1000"/>
+            <w:tcW w:type="dxa" w:w="1481"/>
             <w:tcBorders>
               <w:top w:val="single" w:color="BFC7D1" w:sz="4"/>
               <w:left w:val="single" w:color="BFC7D1" w:sz="4"/>
@@ -26563,7 +25919,7 @@
         </w:tc>
         <w:tc>
           <w:tcPr>
-            <w:tcW w:type="dxa" w:w="2715"/>
+            <w:tcW w:type="dxa" w:w="2560"/>
             <w:tcBorders>
               <w:top w:val="single" w:color="BFC7D1" w:sz="4"/>
               <w:left w:val="single" w:color="BFC7D1" w:sz="4"/>
@@ -26598,7 +25954,7 @@
         </w:trPr>
         <w:tc>
           <w:tcPr>
-            <w:tcW w:type="dxa" w:w="1358"/>
+            <w:tcW w:type="dxa" w:w="1279"/>
             <w:tcBorders>
               <w:top w:val="single" w:color="BFC7D1" w:sz="4"/>
               <w:left w:val="single" w:color="BFC7D1" w:sz="4"/>
@@ -26627,7 +25983,7 @@
         </w:tc>
         <w:tc>
           <w:tcPr>
-            <w:tcW w:type="dxa" w:w="4287"/>
+            <w:tcW w:type="dxa" w:w="4040"/>
             <w:tcBorders>
               <w:top w:val="single" w:color="BFC7D1" w:sz="4"/>
               <w:left w:val="single" w:color="BFC7D1" w:sz="4"/>
@@ -26687,7 +26043,7 @@
         </w:tc>
         <w:tc>
           <w:tcPr>
-            <w:tcW w:type="dxa" w:w="1000"/>
+            <w:tcW w:type="dxa" w:w="1481"/>
             <w:tcBorders>
               <w:top w:val="single" w:color="BFC7D1" w:sz="4"/>
               <w:left w:val="single" w:color="BFC7D1" w:sz="4"/>
@@ -26716,7 +26072,7 @@
         </w:tc>
         <w:tc>
           <w:tcPr>
-            <w:tcW w:type="dxa" w:w="2715"/>
+            <w:tcW w:type="dxa" w:w="2560"/>
             <w:tcBorders>
               <w:top w:val="single" w:color="BFC7D1" w:sz="4"/>
               <w:left w:val="single" w:color="BFC7D1" w:sz="4"/>
@@ -26751,7 +26107,7 @@
         </w:trPr>
         <w:tc>
           <w:tcPr>
-            <w:tcW w:type="dxa" w:w="1358"/>
+            <w:tcW w:type="dxa" w:w="1279"/>
             <w:tcBorders>
               <w:top w:val="single" w:color="BFC7D1" w:sz="4"/>
               <w:left w:val="single" w:color="BFC7D1" w:sz="4"/>
@@ -26780,7 +26136,7 @@
         </w:tc>
         <w:tc>
           <w:tcPr>
-            <w:tcW w:type="dxa" w:w="4287"/>
+            <w:tcW w:type="dxa" w:w="4040"/>
             <w:tcBorders>
               <w:top w:val="single" w:color="BFC7D1" w:sz="4"/>
               <w:left w:val="single" w:color="BFC7D1" w:sz="4"/>
@@ -26810,59 +26166,59 @@
         </w:tc>
         <w:tc>
           <w:tcPr>
-            <w:tcW w:type="dxa" w:w="1000"/>
-            <w:tcBorders>
-              <w:top w:val="single" w:color="BFC7D1" w:sz="4"/>
-              <w:left w:val="single" w:color="BFC7D1" w:sz="4"/>
-              <w:bottom w:val="single" w:color="BFC7D1" w:sz="4"/>
-              <w:right w:val="single" w:color="BFC7D1" w:sz="4"/>
-            </w:tcBorders>
-            <w:tcMar>
-              <w:top w:type="dxa" w:w="60"/>
-              <w:left w:type="dxa" w:w="90"/>
-              <w:bottom w:type="dxa" w:w="60"/>
-              <w:right w:type="dxa" w:w="90"/>
-            </w:tcMar>
-          </w:tcPr>
-          <w:p>
-            <w:pPr>
-              <w:spacing w:after="0" w:line="252"/>
-            </w:pPr>
-            <w:r>
-              <w:rPr>
-                <w:sz w:val="18"/>
-                <w:szCs w:val="18"/>
-              </w:rPr>
-              <w:t xml:space="preserve">public token</w:t>
-            </w:r>
-          </w:p>
-        </w:tc>
-        <w:tc>
-          <w:tcPr>
-            <w:tcW w:type="dxa" w:w="2715"/>
-            <w:tcBorders>
-              <w:top w:val="single" w:color="BFC7D1" w:sz="4"/>
-              <w:left w:val="single" w:color="BFC7D1" w:sz="4"/>
-              <w:bottom w:val="single" w:color="BFC7D1" w:sz="4"/>
-              <w:right w:val="single" w:color="BFC7D1" w:sz="4"/>
-            </w:tcBorders>
-            <w:tcMar>
-              <w:top w:type="dxa" w:w="60"/>
-              <w:left w:type="dxa" w:w="90"/>
-              <w:bottom w:type="dxa" w:w="60"/>
-              <w:right w:type="dxa" w:w="90"/>
-            </w:tcMar>
-          </w:tcPr>
-          <w:p>
-            <w:pPr>
-              <w:spacing w:after="0" w:line="252"/>
-            </w:pPr>
-            <w:r>
-              <w:rPr>
-                <w:sz w:val="18"/>
-                <w:szCs w:val="18"/>
-              </w:rPr>
-              <w:t xml:space="preserve">rendered HTML for embeds</w:t>
+            <w:tcW w:type="dxa" w:w="1481"/>
+            <w:tcBorders>
+              <w:top w:val="single" w:color="BFC7D1" w:sz="4"/>
+              <w:left w:val="single" w:color="BFC7D1" w:sz="4"/>
+              <w:bottom w:val="single" w:color="BFC7D1" w:sz="4"/>
+              <w:right w:val="single" w:color="BFC7D1" w:sz="4"/>
+            </w:tcBorders>
+            <w:tcMar>
+              <w:top w:type="dxa" w:w="60"/>
+              <w:left w:type="dxa" w:w="90"/>
+              <w:bottom w:type="dxa" w:w="60"/>
+              <w:right w:type="dxa" w:w="90"/>
+            </w:tcMar>
+          </w:tcPr>
+          <w:p>
+            <w:pPr>
+              <w:spacing w:after="0" w:line="252"/>
+            </w:pPr>
+            <w:r>
+              <w:rPr>
+                <w:sz w:val="18"/>
+                <w:szCs w:val="18"/>
+              </w:rPr>
+              <w:t xml:space="preserve">admin</w:t>
+            </w:r>
+          </w:p>
+        </w:tc>
+        <w:tc>
+          <w:tcPr>
+            <w:tcW w:type="dxa" w:w="2560"/>
+            <w:tcBorders>
+              <w:top w:val="single" w:color="BFC7D1" w:sz="4"/>
+              <w:left w:val="single" w:color="BFC7D1" w:sz="4"/>
+              <w:bottom w:val="single" w:color="BFC7D1" w:sz="4"/>
+              <w:right w:val="single" w:color="BFC7D1" w:sz="4"/>
+            </w:tcBorders>
+            <w:tcMar>
+              <w:top w:type="dxa" w:w="60"/>
+              <w:left w:type="dxa" w:w="90"/>
+              <w:bottom w:type="dxa" w:w="60"/>
+              <w:right w:type="dxa" w:w="90"/>
+            </w:tcMar>
+          </w:tcPr>
+          <w:p>
+            <w:pPr>
+              <w:spacing w:after="0" w:line="252"/>
+            </w:pPr>
+            <w:r>
+              <w:rPr>
+                <w:sz w:val="18"/>
+                <w:szCs w:val="18"/>
+              </w:rPr>
+              <w:t xml:space="preserve">rendered HTML preview</w:t>
             </w:r>
           </w:p>
         </w:tc>
@@ -26874,7 +26230,7 @@
         </w:trPr>
         <w:tc>
           <w:tcPr>
-            <w:tcW w:type="dxa" w:w="1358"/>
+            <w:tcW w:type="dxa" w:w="1279"/>
             <w:tcBorders>
               <w:top w:val="single" w:color="BFC7D1" w:sz="4"/>
               <w:left w:val="single" w:color="BFC7D1" w:sz="4"/>
@@ -26903,7 +26259,7 @@
         </w:tc>
         <w:tc>
           <w:tcPr>
-            <w:tcW w:type="dxa" w:w="4287"/>
+            <w:tcW w:type="dxa" w:w="4040"/>
             <w:tcBorders>
               <w:top w:val="single" w:color="BFC7D1" w:sz="4"/>
               <w:left w:val="single" w:color="BFC7D1" w:sz="4"/>
@@ -26933,7 +26289,7 @@
         </w:tc>
         <w:tc>
           <w:tcPr>
-            <w:tcW w:type="dxa" w:w="1000"/>
+            <w:tcW w:type="dxa" w:w="1481"/>
             <w:tcBorders>
               <w:top w:val="single" w:color="BFC7D1" w:sz="4"/>
               <w:left w:val="single" w:color="BFC7D1" w:sz="4"/>
@@ -26962,30 +26318,30 @@
         </w:tc>
         <w:tc>
           <w:tcPr>
-            <w:tcW w:type="dxa" w:w="2715"/>
-            <w:tcBorders>
-              <w:top w:val="single" w:color="BFC7D1" w:sz="4"/>
-              <w:left w:val="single" w:color="BFC7D1" w:sz="4"/>
-              <w:bottom w:val="single" w:color="BFC7D1" w:sz="4"/>
-              <w:right w:val="single" w:color="BFC7D1" w:sz="4"/>
-            </w:tcBorders>
-            <w:tcMar>
-              <w:top w:type="dxa" w:w="60"/>
-              <w:left w:type="dxa" w:w="90"/>
-              <w:bottom w:type="dxa" w:w="60"/>
-              <w:right w:type="dxa" w:w="90"/>
-            </w:tcMar>
-          </w:tcPr>
-          <w:p>
-            <w:pPr>
-              <w:spacing w:after="0" w:line="252"/>
-            </w:pPr>
-            <w:r>
-              <w:rPr>
-                <w:sz w:val="18"/>
-                <w:szCs w:val="18"/>
-              </w:rPr>
-              <w:t xml:space="preserve">wordpress / joomla / gsites / html</w:t>
+            <w:tcW w:type="dxa" w:w="2560"/>
+            <w:tcBorders>
+              <w:top w:val="single" w:color="BFC7D1" w:sz="4"/>
+              <w:left w:val="single" w:color="BFC7D1" w:sz="4"/>
+              <w:bottom w:val="single" w:color="BFC7D1" w:sz="4"/>
+              <w:right w:val="single" w:color="BFC7D1" w:sz="4"/>
+            </w:tcBorders>
+            <w:tcMar>
+              <w:top w:type="dxa" w:w="60"/>
+              <w:left w:type="dxa" w:w="90"/>
+              <w:bottom w:type="dxa" w:w="60"/>
+              <w:right w:type="dxa" w:w="90"/>
+            </w:tcMar>
+          </w:tcPr>
+          <w:p>
+            <w:pPr>
+              <w:spacing w:after="0" w:line="252"/>
+            </w:pPr>
+            <w:r>
+              <w:rPr>
+                <w:sz w:val="18"/>
+                <w:szCs w:val="18"/>
+              </w:rPr>
+              <w:t xml:space="preserve">wordpress / joomla / html</w:t>
             </w:r>
           </w:p>
         </w:tc>
@@ -26997,7 +26353,7 @@
         </w:trPr>
         <w:tc>
           <w:tcPr>
-            <w:tcW w:type="dxa" w:w="1358"/>
+            <w:tcW w:type="dxa" w:w="1279"/>
             <w:tcBorders>
               <w:top w:val="single" w:color="BFC7D1" w:sz="4"/>
               <w:left w:val="single" w:color="BFC7D1" w:sz="4"/>
@@ -27026,7 +26382,7 @@
         </w:tc>
         <w:tc>
           <w:tcPr>
-            <w:tcW w:type="dxa" w:w="4287"/>
+            <w:tcW w:type="dxa" w:w="4040"/>
             <w:tcBorders>
               <w:top w:val="single" w:color="BFC7D1" w:sz="4"/>
               <w:left w:val="single" w:color="BFC7D1" w:sz="4"/>
@@ -27086,7 +26442,7 @@
         </w:tc>
         <w:tc>
           <w:tcPr>
-            <w:tcW w:type="dxa" w:w="1000"/>
+            <w:tcW w:type="dxa" w:w="1481"/>
             <w:tcBorders>
               <w:top w:val="single" w:color="BFC7D1" w:sz="4"/>
               <w:left w:val="single" w:color="BFC7D1" w:sz="4"/>
@@ -27115,7 +26471,7 @@
         </w:tc>
         <w:tc>
           <w:tcPr>
-            <w:tcW w:type="dxa" w:w="2715"/>
+            <w:tcW w:type="dxa" w:w="2560"/>
             <w:tcBorders>
               <w:top w:val="single" w:color="BFC7D1" w:sz="4"/>
               <w:left w:val="single" w:color="BFC7D1" w:sz="4"/>
@@ -27150,7 +26506,7 @@
         </w:trPr>
         <w:tc>
           <w:tcPr>
-            <w:tcW w:type="dxa" w:w="1358"/>
+            <w:tcW w:type="dxa" w:w="1279"/>
             <w:tcBorders>
               <w:top w:val="single" w:color="BFC7D1" w:sz="4"/>
               <w:left w:val="single" w:color="BFC7D1" w:sz="4"/>
@@ -27179,7 +26535,7 @@
         </w:tc>
         <w:tc>
           <w:tcPr>
-            <w:tcW w:type="dxa" w:w="4287"/>
+            <w:tcW w:type="dxa" w:w="4040"/>
             <w:tcBorders>
               <w:top w:val="single" w:color="BFC7D1" w:sz="4"/>
               <w:left w:val="single" w:color="BFC7D1" w:sz="4"/>
@@ -27224,7 +26580,7 @@
         </w:tc>
         <w:tc>
           <w:tcPr>
-            <w:tcW w:type="dxa" w:w="1000"/>
+            <w:tcW w:type="dxa" w:w="1481"/>
             <w:tcBorders>
               <w:top w:val="single" w:color="BFC7D1" w:sz="4"/>
               <w:left w:val="single" w:color="BFC7D1" w:sz="4"/>
@@ -27253,7 +26609,7 @@
         </w:tc>
         <w:tc>
           <w:tcPr>
-            <w:tcW w:type="dxa" w:w="2715"/>
+            <w:tcW w:type="dxa" w:w="2560"/>
             <w:tcBorders>
               <w:top w:val="single" w:color="BFC7D1" w:sz="4"/>
               <w:left w:val="single" w:color="BFC7D1" w:sz="4"/>
@@ -27288,7 +26644,7 @@
         </w:trPr>
         <w:tc>
           <w:tcPr>
-            <w:tcW w:type="dxa" w:w="1358"/>
+            <w:tcW w:type="dxa" w:w="1279"/>
             <w:tcBorders>
               <w:top w:val="single" w:color="BFC7D1" w:sz="4"/>
               <w:left w:val="single" w:color="BFC7D1" w:sz="4"/>
@@ -27317,7 +26673,7 @@
         </w:tc>
         <w:tc>
           <w:tcPr>
-            <w:tcW w:type="dxa" w:w="4287"/>
+            <w:tcW w:type="dxa" w:w="4040"/>
             <w:tcBorders>
               <w:top w:val="single" w:color="BFC7D1" w:sz="4"/>
               <w:left w:val="single" w:color="BFC7D1" w:sz="4"/>
@@ -27347,7 +26703,7 @@
         </w:tc>
         <w:tc>
           <w:tcPr>
-            <w:tcW w:type="dxa" w:w="1000"/>
+            <w:tcW w:type="dxa" w:w="1481"/>
             <w:tcBorders>
               <w:top w:val="single" w:color="BFC7D1" w:sz="4"/>
               <w:left w:val="single" w:color="BFC7D1" w:sz="4"/>
@@ -27376,7 +26732,7 @@
         </w:tc>
         <w:tc>
           <w:tcPr>
-            <w:tcW w:type="dxa" w:w="2715"/>
+            <w:tcW w:type="dxa" w:w="2560"/>
             <w:tcBorders>
               <w:top w:val="single" w:color="BFC7D1" w:sz="4"/>
               <w:left w:val="single" w:color="BFC7D1" w:sz="4"/>
@@ -27411,7 +26767,7 @@
         </w:trPr>
         <w:tc>
           <w:tcPr>
-            <w:tcW w:type="dxa" w:w="1358"/>
+            <w:tcW w:type="dxa" w:w="1279"/>
             <w:tcBorders>
               <w:top w:val="single" w:color="BFC7D1" w:sz="4"/>
               <w:left w:val="single" w:color="BFC7D1" w:sz="4"/>
@@ -27440,7 +26796,7 @@
         </w:tc>
         <w:tc>
           <w:tcPr>
-            <w:tcW w:type="dxa" w:w="4287"/>
+            <w:tcW w:type="dxa" w:w="4040"/>
             <w:tcBorders>
               <w:top w:val="single" w:color="BFC7D1" w:sz="4"/>
               <w:left w:val="single" w:color="BFC7D1" w:sz="4"/>
@@ -27470,7 +26826,7 @@
         </w:tc>
         <w:tc>
           <w:tcPr>
-            <w:tcW w:type="dxa" w:w="1000"/>
+            <w:tcW w:type="dxa" w:w="1481"/>
             <w:tcBorders>
               <w:top w:val="single" w:color="BFC7D1" w:sz="4"/>
               <w:left w:val="single" w:color="BFC7D1" w:sz="4"/>
@@ -27499,7 +26855,7 @@
         </w:tc>
         <w:tc>
           <w:tcPr>
-            <w:tcW w:type="dxa" w:w="2715"/>
+            <w:tcW w:type="dxa" w:w="2560"/>
             <w:tcBorders>
               <w:top w:val="single" w:color="BFC7D1" w:sz="4"/>
               <w:left w:val="single" w:color="BFC7D1" w:sz="4"/>
@@ -27534,7 +26890,7 @@
         </w:trPr>
         <w:tc>
           <w:tcPr>
-            <w:tcW w:type="dxa" w:w="1358"/>
+            <w:tcW w:type="dxa" w:w="1279"/>
             <w:tcBorders>
               <w:top w:val="single" w:color="BFC7D1" w:sz="4"/>
               <w:left w:val="single" w:color="BFC7D1" w:sz="4"/>
@@ -27563,7 +26919,7 @@
         </w:tc>
         <w:tc>
           <w:tcPr>
-            <w:tcW w:type="dxa" w:w="4287"/>
+            <w:tcW w:type="dxa" w:w="4040"/>
             <w:tcBorders>
               <w:top w:val="single" w:color="BFC7D1" w:sz="4"/>
               <w:left w:val="single" w:color="BFC7D1" w:sz="4"/>
@@ -27593,36 +26949,36 @@
         </w:tc>
         <w:tc>
           <w:tcPr>
-            <w:tcW w:type="dxa" w:w="1000"/>
-            <w:tcBorders>
-              <w:top w:val="single" w:color="BFC7D1" w:sz="4"/>
-              <w:left w:val="single" w:color="BFC7D1" w:sz="4"/>
-              <w:bottom w:val="single" w:color="BFC7D1" w:sz="4"/>
-              <w:right w:val="single" w:color="BFC7D1" w:sz="4"/>
-            </w:tcBorders>
-            <w:tcMar>
-              <w:top w:type="dxa" w:w="60"/>
-              <w:left w:type="dxa" w:w="90"/>
-              <w:bottom w:type="dxa" w:w="60"/>
-              <w:right w:type="dxa" w:w="90"/>
-            </w:tcMar>
-          </w:tcPr>
-          <w:p>
-            <w:pPr>
-              <w:spacing w:after="0" w:line="252"/>
-            </w:pPr>
-            <w:r>
-              <w:rPr>
-                <w:sz w:val="18"/>
-                <w:szCs w:val="18"/>
-              </w:rPr>
-              <w:t xml:space="preserve">public + token</w:t>
-            </w:r>
-          </w:p>
-        </w:tc>
-        <w:tc>
-          <w:tcPr>
-            <w:tcW w:type="dxa" w:w="2715"/>
+            <w:tcW w:type="dxa" w:w="1481"/>
+            <w:tcBorders>
+              <w:top w:val="single" w:color="BFC7D1" w:sz="4"/>
+              <w:left w:val="single" w:color="BFC7D1" w:sz="4"/>
+              <w:bottom w:val="single" w:color="BFC7D1" w:sz="4"/>
+              <w:right w:val="single" w:color="BFC7D1" w:sz="4"/>
+            </w:tcBorders>
+            <w:tcMar>
+              <w:top w:type="dxa" w:w="60"/>
+              <w:left w:type="dxa" w:w="90"/>
+              <w:bottom w:type="dxa" w:w="60"/>
+              <w:right w:type="dxa" w:w="90"/>
+            </w:tcMar>
+          </w:tcPr>
+          <w:p>
+            <w:pPr>
+              <w:spacing w:after="0" w:line="252"/>
+            </w:pPr>
+            <w:r>
+              <w:rPr>
+                <w:sz w:val="18"/>
+                <w:szCs w:val="18"/>
+              </w:rPr>
+              <w:t xml:space="preserve">public + session token</w:t>
+            </w:r>
+          </w:p>
+        </w:tc>
+        <w:tc>
+          <w:tcPr>
+            <w:tcW w:type="dxa" w:w="2560"/>
             <w:tcBorders>
               <w:top w:val="single" w:color="BFC7D1" w:sz="4"/>
               <w:left w:val="single" w:color="BFC7D1" w:sz="4"/>
@@ -27657,7 +27013,7 @@
         </w:trPr>
         <w:tc>
           <w:tcPr>
-            <w:tcW w:type="dxa" w:w="1358"/>
+            <w:tcW w:type="dxa" w:w="1279"/>
             <w:tcBorders>
               <w:top w:val="single" w:color="BFC7D1" w:sz="4"/>
               <w:left w:val="single" w:color="BFC7D1" w:sz="4"/>
@@ -27686,7 +27042,7 @@
         </w:tc>
         <w:tc>
           <w:tcPr>
-            <w:tcW w:type="dxa" w:w="4287"/>
+            <w:tcW w:type="dxa" w:w="4040"/>
             <w:tcBorders>
               <w:top w:val="single" w:color="BFC7D1" w:sz="4"/>
               <w:left w:val="single" w:color="BFC7D1" w:sz="4"/>
@@ -27716,7 +27072,7 @@
         </w:tc>
         <w:tc>
           <w:tcPr>
-            <w:tcW w:type="dxa" w:w="1000"/>
+            <w:tcW w:type="dxa" w:w="1481"/>
             <w:tcBorders>
               <w:top w:val="single" w:color="BFC7D1" w:sz="4"/>
               <w:left w:val="single" w:color="BFC7D1" w:sz="4"/>
@@ -27745,7 +27101,7 @@
         </w:tc>
         <w:tc>
           <w:tcPr>
-            <w:tcW w:type="dxa" w:w="2715"/>
+            <w:tcW w:type="dxa" w:w="2560"/>
             <w:tcBorders>
               <w:top w:val="single" w:color="BFC7D1" w:sz="4"/>
               <w:left w:val="single" w:color="BFC7D1" w:sz="4"/>
@@ -27780,7 +27136,7 @@
         </w:trPr>
         <w:tc>
           <w:tcPr>
-            <w:tcW w:type="dxa" w:w="1358"/>
+            <w:tcW w:type="dxa" w:w="1279"/>
             <w:tcBorders>
               <w:top w:val="single" w:color="BFC7D1" w:sz="4"/>
               <w:left w:val="single" w:color="BFC7D1" w:sz="4"/>
@@ -27809,7 +27165,7 @@
         </w:tc>
         <w:tc>
           <w:tcPr>
-            <w:tcW w:type="dxa" w:w="4287"/>
+            <w:tcW w:type="dxa" w:w="4040"/>
             <w:tcBorders>
               <w:top w:val="single" w:color="BFC7D1" w:sz="4"/>
               <w:left w:val="single" w:color="BFC7D1" w:sz="4"/>
@@ -27884,7 +27240,7 @@
         </w:tc>
         <w:tc>
           <w:tcPr>
-            <w:tcW w:type="dxa" w:w="1000"/>
+            <w:tcW w:type="dxa" w:w="1481"/>
             <w:tcBorders>
               <w:top w:val="single" w:color="BFC7D1" w:sz="4"/>
               <w:left w:val="single" w:color="BFC7D1" w:sz="4"/>
@@ -27913,7 +27269,7 @@
         </w:tc>
         <w:tc>
           <w:tcPr>
-            <w:tcW w:type="dxa" w:w="2715"/>
+            <w:tcW w:type="dxa" w:w="2560"/>
             <w:tcBorders>
               <w:top w:val="single" w:color="BFC7D1" w:sz="4"/>
               <w:left w:val="single" w:color="BFC7D1" w:sz="4"/>
@@ -27948,7 +27304,7 @@
         </w:trPr>
         <w:tc>
           <w:tcPr>
-            <w:tcW w:type="dxa" w:w="1358"/>
+            <w:tcW w:type="dxa" w:w="1279"/>
             <w:tcBorders>
               <w:top w:val="single" w:color="BFC7D1" w:sz="4"/>
               <w:left w:val="single" w:color="BFC7D1" w:sz="4"/>
@@ -27977,7 +27333,7 @@
         </w:tc>
         <w:tc>
           <w:tcPr>
-            <w:tcW w:type="dxa" w:w="4287"/>
+            <w:tcW w:type="dxa" w:w="4040"/>
             <w:tcBorders>
               <w:top w:val="single" w:color="BFC7D1" w:sz="4"/>
               <w:left w:val="single" w:color="BFC7D1" w:sz="4"/>
@@ -28022,7 +27378,7 @@
         </w:tc>
         <w:tc>
           <w:tcPr>
-            <w:tcW w:type="dxa" w:w="1000"/>
+            <w:tcW w:type="dxa" w:w="1481"/>
             <w:tcBorders>
               <w:top w:val="single" w:color="BFC7D1" w:sz="4"/>
               <w:left w:val="single" w:color="BFC7D1" w:sz="4"/>
@@ -28051,7 +27407,7 @@
         </w:tc>
         <w:tc>
           <w:tcPr>
-            <w:tcW w:type="dxa" w:w="2715"/>
+            <w:tcW w:type="dxa" w:w="2560"/>
             <w:tcBorders>
               <w:top w:val="single" w:color="BFC7D1" w:sz="4"/>
               <w:left w:val="single" w:color="BFC7D1" w:sz="4"/>
@@ -28086,7 +27442,7 @@
         </w:trPr>
         <w:tc>
           <w:tcPr>
-            <w:tcW w:type="dxa" w:w="1358"/>
+            <w:tcW w:type="dxa" w:w="1279"/>
             <w:tcBorders>
               <w:top w:val="single" w:color="BFC7D1" w:sz="4"/>
               <w:left w:val="single" w:color="BFC7D1" w:sz="4"/>
@@ -28115,7 +27471,7 @@
         </w:tc>
         <w:tc>
           <w:tcPr>
-            <w:tcW w:type="dxa" w:w="4287"/>
+            <w:tcW w:type="dxa" w:w="4040"/>
             <w:tcBorders>
               <w:top w:val="single" w:color="BFC7D1" w:sz="4"/>
               <w:left w:val="single" w:color="BFC7D1" w:sz="4"/>
@@ -28160,7 +27516,7 @@
         </w:tc>
         <w:tc>
           <w:tcPr>
-            <w:tcW w:type="dxa" w:w="1000"/>
+            <w:tcW w:type="dxa" w:w="1481"/>
             <w:tcBorders>
               <w:top w:val="single" w:color="BFC7D1" w:sz="4"/>
               <w:left w:val="single" w:color="BFC7D1" w:sz="4"/>
@@ -28189,7 +27545,7 @@
         </w:tc>
         <w:tc>
           <w:tcPr>
-            <w:tcW w:type="dxa" w:w="2715"/>
+            <w:tcW w:type="dxa" w:w="2560"/>
             <w:tcBorders>
               <w:top w:val="single" w:color="BFC7D1" w:sz="4"/>
               <w:left w:val="single" w:color="BFC7D1" w:sz="4"/>
@@ -28224,7 +27580,7 @@
         </w:trPr>
         <w:tc>
           <w:tcPr>
-            <w:tcW w:type="dxa" w:w="1358"/>
+            <w:tcW w:type="dxa" w:w="1279"/>
             <w:tcBorders>
               <w:top w:val="single" w:color="BFC7D1" w:sz="4"/>
               <w:left w:val="single" w:color="BFC7D1" w:sz="4"/>
@@ -28253,7 +27609,7 @@
         </w:tc>
         <w:tc>
           <w:tcPr>
-            <w:tcW w:type="dxa" w:w="4287"/>
+            <w:tcW w:type="dxa" w:w="4040"/>
             <w:tcBorders>
               <w:top w:val="single" w:color="BFC7D1" w:sz="4"/>
               <w:left w:val="single" w:color="BFC7D1" w:sz="4"/>
@@ -28298,7 +27654,7 @@
         </w:tc>
         <w:tc>
           <w:tcPr>
-            <w:tcW w:type="dxa" w:w="1000"/>
+            <w:tcW w:type="dxa" w:w="1481"/>
             <w:tcBorders>
               <w:top w:val="single" w:color="BFC7D1" w:sz="4"/>
               <w:left w:val="single" w:color="BFC7D1" w:sz="4"/>
@@ -28327,7 +27683,7 @@
         </w:tc>
         <w:tc>
           <w:tcPr>
-            <w:tcW w:type="dxa" w:w="2715"/>
+            <w:tcW w:type="dxa" w:w="2560"/>
             <w:tcBorders>
               <w:top w:val="single" w:color="BFC7D1" w:sz="4"/>
               <w:left w:val="single" w:color="BFC7D1" w:sz="4"/>
@@ -28362,7 +27718,7 @@
         </w:trPr>
         <w:tc>
           <w:tcPr>
-            <w:tcW w:type="dxa" w:w="1358"/>
+            <w:tcW w:type="dxa" w:w="1279"/>
             <w:tcBorders>
               <w:top w:val="single" w:color="BFC7D1" w:sz="4"/>
               <w:left w:val="single" w:color="BFC7D1" w:sz="4"/>
@@ -28391,7 +27747,7 @@
         </w:tc>
         <w:tc>
           <w:tcPr>
-            <w:tcW w:type="dxa" w:w="4287"/>
+            <w:tcW w:type="dxa" w:w="4040"/>
             <w:tcBorders>
               <w:top w:val="single" w:color="BFC7D1" w:sz="4"/>
               <w:left w:val="single" w:color="BFC7D1" w:sz="4"/>
@@ -28436,7 +27792,7 @@
         </w:tc>
         <w:tc>
           <w:tcPr>
-            <w:tcW w:type="dxa" w:w="1000"/>
+            <w:tcW w:type="dxa" w:w="1481"/>
             <w:tcBorders>
               <w:top w:val="single" w:color="BFC7D1" w:sz="4"/>
               <w:left w:val="single" w:color="BFC7D1" w:sz="4"/>
@@ -28465,7 +27821,7 @@
         </w:tc>
         <w:tc>
           <w:tcPr>
-            <w:tcW w:type="dxa" w:w="2715"/>
+            <w:tcW w:type="dxa" w:w="2560"/>
             <w:tcBorders>
               <w:top w:val="single" w:color="BFC7D1" w:sz="4"/>
               <w:left w:val="single" w:color="BFC7D1" w:sz="4"/>
@@ -28500,7 +27856,7 @@
         </w:trPr>
         <w:tc>
           <w:tcPr>
-            <w:tcW w:type="dxa" w:w="1358"/>
+            <w:tcW w:type="dxa" w:w="1279"/>
             <w:tcBorders>
               <w:top w:val="single" w:color="BFC7D1" w:sz="4"/>
               <w:left w:val="single" w:color="BFC7D1" w:sz="4"/>
@@ -28529,7 +27885,7 @@
         </w:tc>
         <w:tc>
           <w:tcPr>
-            <w:tcW w:type="dxa" w:w="4287"/>
+            <w:tcW w:type="dxa" w:w="4040"/>
             <w:tcBorders>
               <w:top w:val="single" w:color="BFC7D1" w:sz="4"/>
               <w:left w:val="single" w:color="BFC7D1" w:sz="4"/>
@@ -28559,7 +27915,7 @@
         </w:tc>
         <w:tc>
           <w:tcPr>
-            <w:tcW w:type="dxa" w:w="1000"/>
+            <w:tcW w:type="dxa" w:w="1481"/>
             <w:tcBorders>
               <w:top w:val="single" w:color="BFC7D1" w:sz="4"/>
               <w:left w:val="single" w:color="BFC7D1" w:sz="4"/>
@@ -28588,7 +27944,7 @@
         </w:tc>
         <w:tc>
           <w:tcPr>
-            <w:tcW w:type="dxa" w:w="2715"/>
+            <w:tcW w:type="dxa" w:w="2560"/>
             <w:tcBorders>
               <w:top w:val="single" w:color="BFC7D1" w:sz="4"/>
               <w:left w:val="single" w:color="BFC7D1" w:sz="4"/>
@@ -28623,7 +27979,7 @@
         </w:trPr>
         <w:tc>
           <w:tcPr>
-            <w:tcW w:type="dxa" w:w="1358"/>
+            <w:tcW w:type="dxa" w:w="1279"/>
             <w:tcBorders>
               <w:top w:val="single" w:color="BFC7D1" w:sz="4"/>
               <w:left w:val="single" w:color="BFC7D1" w:sz="4"/>
@@ -28652,7 +28008,7 @@
         </w:tc>
         <w:tc>
           <w:tcPr>
-            <w:tcW w:type="dxa" w:w="4287"/>
+            <w:tcW w:type="dxa" w:w="4040"/>
             <w:tcBorders>
               <w:top w:val="single" w:color="BFC7D1" w:sz="4"/>
               <w:left w:val="single" w:color="BFC7D1" w:sz="4"/>
@@ -28682,7 +28038,7 @@
         </w:tc>
         <w:tc>
           <w:tcPr>
-            <w:tcW w:type="dxa" w:w="1000"/>
+            <w:tcW w:type="dxa" w:w="1481"/>
             <w:tcBorders>
               <w:top w:val="single" w:color="BFC7D1" w:sz="4"/>
               <w:left w:val="single" w:color="BFC7D1" w:sz="4"/>
@@ -28711,7 +28067,7 @@
         </w:tc>
         <w:tc>
           <w:tcPr>
-            <w:tcW w:type="dxa" w:w="2715"/>
+            <w:tcW w:type="dxa" w:w="2560"/>
             <w:tcBorders>
               <w:top w:val="single" w:color="BFC7D1" w:sz="4"/>
               <w:left w:val="single" w:color="BFC7D1" w:sz="4"/>
@@ -28746,7 +28102,7 @@
         </w:trPr>
         <w:tc>
           <w:tcPr>
-            <w:tcW w:type="dxa" w:w="1358"/>
+            <w:tcW w:type="dxa" w:w="1279"/>
             <w:tcBorders>
               <w:top w:val="single" w:color="BFC7D1" w:sz="4"/>
               <w:left w:val="single" w:color="BFC7D1" w:sz="4"/>
@@ -28775,7 +28131,7 @@
         </w:tc>
         <w:tc>
           <w:tcPr>
-            <w:tcW w:type="dxa" w:w="4287"/>
+            <w:tcW w:type="dxa" w:w="4040"/>
             <w:tcBorders>
               <w:top w:val="single" w:color="BFC7D1" w:sz="4"/>
               <w:left w:val="single" w:color="BFC7D1" w:sz="4"/>
@@ -28850,7 +28206,7 @@
         </w:tc>
         <w:tc>
           <w:tcPr>
-            <w:tcW w:type="dxa" w:w="1000"/>
+            <w:tcW w:type="dxa" w:w="1481"/>
             <w:tcBorders>
               <w:top w:val="single" w:color="BFC7D1" w:sz="4"/>
               <w:left w:val="single" w:color="BFC7D1" w:sz="4"/>
@@ -28879,7 +28235,7 @@
         </w:tc>
         <w:tc>
           <w:tcPr>
-            <w:tcW w:type="dxa" w:w="2715"/>
+            <w:tcW w:type="dxa" w:w="2560"/>
             <w:tcBorders>
               <w:top w:val="single" w:color="BFC7D1" w:sz="4"/>
               <w:left w:val="single" w:color="BFC7D1" w:sz="4"/>
@@ -28914,7 +28270,7 @@
         </w:trPr>
         <w:tc>
           <w:tcPr>
-            <w:tcW w:type="dxa" w:w="1358"/>
+            <w:tcW w:type="dxa" w:w="1279"/>
             <w:tcBorders>
               <w:top w:val="single" w:color="BFC7D1" w:sz="4"/>
               <w:left w:val="single" w:color="BFC7D1" w:sz="4"/>
@@ -28943,7 +28299,7 @@
         </w:tc>
         <w:tc>
           <w:tcPr>
-            <w:tcW w:type="dxa" w:w="4287"/>
+            <w:tcW w:type="dxa" w:w="4040"/>
             <w:tcBorders>
               <w:top w:val="single" w:color="BFC7D1" w:sz="4"/>
               <w:left w:val="single" w:color="BFC7D1" w:sz="4"/>
@@ -29033,7 +28389,7 @@
         </w:tc>
         <w:tc>
           <w:tcPr>
-            <w:tcW w:type="dxa" w:w="1000"/>
+            <w:tcW w:type="dxa" w:w="1481"/>
             <w:tcBorders>
               <w:top w:val="single" w:color="BFC7D1" w:sz="4"/>
               <w:left w:val="single" w:color="BFC7D1" w:sz="4"/>
@@ -29062,7 +28418,7 @@
         </w:tc>
         <w:tc>
           <w:tcPr>
-            <w:tcW w:type="dxa" w:w="2715"/>
+            <w:tcW w:type="dxa" w:w="2560"/>
             <w:tcBorders>
               <w:top w:val="single" w:color="BFC7D1" w:sz="4"/>
               <w:left w:val="single" w:color="BFC7D1" w:sz="4"/>
@@ -29097,36 +28453,36 @@
         </w:trPr>
         <w:tc>
           <w:tcPr>
-            <w:tcW w:type="dxa" w:w="1358"/>
-            <w:tcBorders>
-              <w:top w:val="single" w:color="BFC7D1" w:sz="4"/>
-              <w:left w:val="single" w:color="BFC7D1" w:sz="4"/>
-              <w:bottom w:val="single" w:color="BFC7D1" w:sz="4"/>
-              <w:right w:val="single" w:color="BFC7D1" w:sz="4"/>
-            </w:tcBorders>
-            <w:tcMar>
-              <w:top w:type="dxa" w:w="60"/>
-              <w:left w:type="dxa" w:w="90"/>
-              <w:bottom w:type="dxa" w:w="60"/>
-              <w:right w:type="dxa" w:w="90"/>
-            </w:tcMar>
-          </w:tcPr>
-          <w:p>
-            <w:pPr>
-              <w:spacing w:after="0" w:line="252"/>
-            </w:pPr>
-            <w:r>
-              <w:rPr>
-                <w:sz w:val="18"/>
-                <w:szCs w:val="18"/>
-              </w:rPr>
-              <w:t xml:space="preserve">GET/POST</w:t>
-            </w:r>
-          </w:p>
-        </w:tc>
-        <w:tc>
-          <w:tcPr>
-            <w:tcW w:type="dxa" w:w="4287"/>
+            <w:tcW w:type="dxa" w:w="1279"/>
+            <w:tcBorders>
+              <w:top w:val="single" w:color="BFC7D1" w:sz="4"/>
+              <w:left w:val="single" w:color="BFC7D1" w:sz="4"/>
+              <w:bottom w:val="single" w:color="BFC7D1" w:sz="4"/>
+              <w:right w:val="single" w:color="BFC7D1" w:sz="4"/>
+            </w:tcBorders>
+            <w:tcMar>
+              <w:top w:type="dxa" w:w="60"/>
+              <w:left w:type="dxa" w:w="90"/>
+              <w:bottom w:type="dxa" w:w="60"/>
+              <w:right w:type="dxa" w:w="90"/>
+            </w:tcMar>
+          </w:tcPr>
+          <w:p>
+            <w:pPr>
+              <w:spacing w:after="0" w:line="252"/>
+            </w:pPr>
+            <w:r>
+              <w:rPr>
+                <w:sz w:val="18"/>
+                <w:szCs w:val="18"/>
+              </w:rPr>
+              <w:t xml:space="preserve">GET</w:t>
+            </w:r>
+          </w:p>
+        </w:tc>
+        <w:tc>
+          <w:tcPr>
+            <w:tcW w:type="dxa" w:w="4040"/>
             <w:tcBorders>
               <w:top w:val="single" w:color="BFC7D1" w:sz="4"/>
               <w:left w:val="single" w:color="BFC7D1" w:sz="4"/>
@@ -29150,28 +28506,13 @@
                 <w:sz w:val="18"/>
                 <w:szCs w:val="18"/>
               </w:rPr>
-              <w:t xml:space="preserve">/gadgets</w:t>
-            </w:r>
-            <w:r>
-              <w:rPr>
-                <w:sz w:val="18"/>
-                <w:szCs w:val="18"/>
-              </w:rPr>
-              <w:t xml:space="preserve">, </w:t>
-            </w:r>
-            <w:r>
-              <w:rPr>
-                <w:rFonts w:ascii="Consolas" w:cs="Consolas" w:eastAsia="Consolas" w:hAnsi="Consolas"/>
-                <w:sz w:val="18"/>
-                <w:szCs w:val="18"/>
-              </w:rPr>
-              <w:t xml:space="preserve">/gadgets/{uuid}</w:t>
-            </w:r>
-          </w:p>
-        </w:tc>
-        <w:tc>
-          <w:tcPr>
-            <w:tcW w:type="dxa" w:w="1000"/>
+              <w:t xml:space="preserve">/health</w:t>
+            </w:r>
+          </w:p>
+        </w:tc>
+        <w:tc>
+          <w:tcPr>
+            <w:tcW w:type="dxa" w:w="1481"/>
             <w:tcBorders>
               <w:top w:val="single" w:color="BFC7D1" w:sz="4"/>
               <w:left w:val="single" w:color="BFC7D1" w:sz="4"/>
@@ -29200,130 +28541,7 @@
         </w:tc>
         <w:tc>
           <w:tcPr>
-            <w:tcW w:type="dxa" w:w="2715"/>
-            <w:tcBorders>
-              <w:top w:val="single" w:color="BFC7D1" w:sz="4"/>
-              <w:left w:val="single" w:color="BFC7D1" w:sz="4"/>
-              <w:bottom w:val="single" w:color="BFC7D1" w:sz="4"/>
-              <w:right w:val="single" w:color="BFC7D1" w:sz="4"/>
-            </w:tcBorders>
-            <w:tcMar>
-              <w:top w:type="dxa" w:w="60"/>
-              <w:left w:type="dxa" w:w="90"/>
-              <w:bottom w:type="dxa" w:w="60"/>
-              <w:right w:type="dxa" w:w="90"/>
-            </w:tcMar>
-          </w:tcPr>
-          <w:p>
-            <w:pPr>
-              <w:spacing w:after="0" w:line="252"/>
-            </w:pPr>
-            <w:r>
-              <w:rPr>
-                <w:sz w:val="18"/>
-                <w:szCs w:val="18"/>
-              </w:rPr>
-              <w:t xml:space="preserve">gadget config</w:t>
-            </w:r>
-          </w:p>
-        </w:tc>
-      </w:tr>
-      <w:tr>
-        <w:trPr>
-          <w:cantSplit/>
-          <w:tblHeader w:val="false"/>
-        </w:trPr>
-        <w:tc>
-          <w:tcPr>
-            <w:tcW w:type="dxa" w:w="1358"/>
-            <w:tcBorders>
-              <w:top w:val="single" w:color="BFC7D1" w:sz="4"/>
-              <w:left w:val="single" w:color="BFC7D1" w:sz="4"/>
-              <w:bottom w:val="single" w:color="BFC7D1" w:sz="4"/>
-              <w:right w:val="single" w:color="BFC7D1" w:sz="4"/>
-            </w:tcBorders>
-            <w:tcMar>
-              <w:top w:type="dxa" w:w="60"/>
-              <w:left w:type="dxa" w:w="90"/>
-              <w:bottom w:type="dxa" w:w="60"/>
-              <w:right w:type="dxa" w:w="90"/>
-            </w:tcMar>
-          </w:tcPr>
-          <w:p>
-            <w:pPr>
-              <w:spacing w:after="0" w:line="252"/>
-            </w:pPr>
-            <w:r>
-              <w:rPr>
-                <w:sz w:val="18"/>
-                <w:szCs w:val="18"/>
-              </w:rPr>
-              <w:t xml:space="preserve">GET</w:t>
-            </w:r>
-          </w:p>
-        </w:tc>
-        <w:tc>
-          <w:tcPr>
-            <w:tcW w:type="dxa" w:w="4287"/>
-            <w:tcBorders>
-              <w:top w:val="single" w:color="BFC7D1" w:sz="4"/>
-              <w:left w:val="single" w:color="BFC7D1" w:sz="4"/>
-              <w:bottom w:val="single" w:color="BFC7D1" w:sz="4"/>
-              <w:right w:val="single" w:color="BFC7D1" w:sz="4"/>
-            </w:tcBorders>
-            <w:tcMar>
-              <w:top w:type="dxa" w:w="60"/>
-              <w:left w:type="dxa" w:w="90"/>
-              <w:bottom w:type="dxa" w:w="60"/>
-              <w:right w:type="dxa" w:w="90"/>
-            </w:tcMar>
-          </w:tcPr>
-          <w:p>
-            <w:pPr>
-              <w:spacing w:after="0" w:line="252"/>
-            </w:pPr>
-            <w:r>
-              <w:rPr>
-                <w:rFonts w:ascii="Consolas" w:cs="Consolas" w:eastAsia="Consolas" w:hAnsi="Consolas"/>
-                <w:sz w:val="18"/>
-                <w:szCs w:val="18"/>
-              </w:rPr>
-              <w:t xml:space="preserve">/health</w:t>
-            </w:r>
-          </w:p>
-        </w:tc>
-        <w:tc>
-          <w:tcPr>
-            <w:tcW w:type="dxa" w:w="1000"/>
-            <w:tcBorders>
-              <w:top w:val="single" w:color="BFC7D1" w:sz="4"/>
-              <w:left w:val="single" w:color="BFC7D1" w:sz="4"/>
-              <w:bottom w:val="single" w:color="BFC7D1" w:sz="4"/>
-              <w:right w:val="single" w:color="BFC7D1" w:sz="4"/>
-            </w:tcBorders>
-            <w:tcMar>
-              <w:top w:type="dxa" w:w="60"/>
-              <w:left w:type="dxa" w:w="90"/>
-              <w:bottom w:type="dxa" w:w="60"/>
-              <w:right w:type="dxa" w:w="90"/>
-            </w:tcMar>
-          </w:tcPr>
-          <w:p>
-            <w:pPr>
-              <w:spacing w:after="0" w:line="252"/>
-            </w:pPr>
-            <w:r>
-              <w:rPr>
-                <w:sz w:val="18"/>
-                <w:szCs w:val="18"/>
-              </w:rPr>
-              <w:t xml:space="preserve">admin</w:t>
-            </w:r>
-          </w:p>
-        </w:tc>
-        <w:tc>
-          <w:tcPr>
-            <w:tcW w:type="dxa" w:w="2715"/>
+            <w:tcW w:type="dxa" w:w="2560"/>
             <w:tcBorders>
               <w:top w:val="single" w:color="BFC7D1" w:sz="4"/>
               <w:left w:val="single" w:color="BFC7D1" w:sz="4"/>

</xml_diff>

<commit_message>
Documentation for Phase 1 (user guide, install guides, spec 4.1)
Co-Authored-By: Claude Fable 5.1 <noreply@anthropic.com>
Claude-Session: https://claude.ai/code/session_01GjP4aQvPNC5gK9soytUbnv
</commit_message>
<xml_diff>
--- a/docs/MediaMarketplace-Studio-Design-Specification.docx
+++ b/docs/MediaMarketplace-Studio-Design-Specification.docx
@@ -30,7 +30,7 @@
         <w:t xml:space="preserve">Version:</w:t>
       </w:r>
       <w:r>
-        <w:t xml:space="preserve"> 4.0 (single package per CMS, single server)</w:t>
+        <w:t xml:space="preserve"> 4.1 (single package per CMS, single server; Phase 1 delivered)</w:t>
       </w:r>
     </w:p>
     <w:p>
@@ -2809,7 +2809,40 @@
         <w:t xml:space="preserve">X-Forwarded-*</w:t>
       </w:r>
       <w:r>
-        <w:t xml:space="preserve">, and streams the response (status, headers, cookies, body) back to the browser.</w:t>
+        <w:t xml:space="preserve">, and streams the response (status, headers, cookies, body) back to the browser. Multipart uploads are rebuilt from </w:t>
+      </w:r>
+      <w:r>
+        <w:rPr>
+          <w:rFonts w:ascii="Consolas" w:cs="Consolas" w:eastAsia="Consolas" w:hAnsi="Consolas"/>
+          <w:sz w:val="19"/>
+          <w:szCs w:val="19"/>
+        </w:rPr>
+        <w:t xml:space="preserve">$_FILES</w:t>
+      </w:r>
+      <w:r>
+        <w:t xml:space="preserve"> because PHP consumes multipart bodies before user code runs; PHP's </w:t>
+      </w:r>
+      <w:r>
+        <w:rPr>
+          <w:rFonts w:ascii="Consolas" w:cs="Consolas" w:eastAsia="Consolas" w:hAnsi="Consolas"/>
+          <w:sz w:val="19"/>
+          <w:szCs w:val="19"/>
+        </w:rPr>
+        <w:t xml:space="preserve">upload_max_filesize</w:t>
+      </w:r>
+      <w:r>
+        <w:t xml:space="preserve"> and </w:t>
+      </w:r>
+      <w:r>
+        <w:rPr>
+          <w:rFonts w:ascii="Consolas" w:cs="Consolas" w:eastAsia="Consolas" w:hAnsi="Consolas"/>
+          <w:sz w:val="19"/>
+          <w:szCs w:val="19"/>
+        </w:rPr>
+        <w:t xml:space="preserve">post_max_size</w:t>
+      </w:r>
+      <w:r>
+        <w:t xml:space="preserve"> therefore cap uploads and are shown on the status page.</w:t>
       </w:r>
     </w:p>
     <w:p>
@@ -19326,9 +19359,9 @@
         </w:tblBorders>
       </w:tblPr>
       <w:tblGrid>
-        <w:gridCol w:w="2019"/>
-        <w:gridCol w:w="3671"/>
-        <w:gridCol w:w="3670"/>
+        <w:gridCol w:w="2340"/>
+        <w:gridCol w:w="3510"/>
+        <w:gridCol w:w="3510"/>
       </w:tblGrid>
       <w:tr>
         <w:trPr>
@@ -19337,7 +19370,7 @@
         </w:trPr>
         <w:tc>
           <w:tcPr>
-            <w:tcW w:type="dxa" w:w="2019"/>
+            <w:tcW w:type="dxa" w:w="2340"/>
             <w:tcBorders>
               <w:top w:val="single" w:color="BFC7D1" w:sz="4"/>
               <w:left w:val="single" w:color="BFC7D1" w:sz="4"/>
@@ -19370,7 +19403,7 @@
         </w:tc>
         <w:tc>
           <w:tcPr>
-            <w:tcW w:type="dxa" w:w="3671"/>
+            <w:tcW w:type="dxa" w:w="3510"/>
             <w:tcBorders>
               <w:top w:val="single" w:color="BFC7D1" w:sz="4"/>
               <w:left w:val="single" w:color="BFC7D1" w:sz="4"/>
@@ -19403,7 +19436,7 @@
         </w:tc>
         <w:tc>
           <w:tcPr>
-            <w:tcW w:type="dxa" w:w="3670"/>
+            <w:tcW w:type="dxa" w:w="3510"/>
             <w:tcBorders>
               <w:top w:val="single" w:color="BFC7D1" w:sz="4"/>
               <w:left w:val="single" w:color="BFC7D1" w:sz="4"/>
@@ -19442,7 +19475,7 @@
         </w:trPr>
         <w:tc>
           <w:tcPr>
-            <w:tcW w:type="dxa" w:w="2019"/>
+            <w:tcW w:type="dxa" w:w="2340"/>
             <w:tcBorders>
               <w:top w:val="single" w:color="BFC7D1" w:sz="4"/>
               <w:left w:val="single" w:color="BFC7D1" w:sz="4"/>
@@ -19480,7 +19513,7 @@
         </w:tc>
         <w:tc>
           <w:tcPr>
-            <w:tcW w:type="dxa" w:w="3671"/>
+            <w:tcW w:type="dxa" w:w="3510"/>
             <w:tcBorders>
               <w:top w:val="single" w:color="BFC7D1" w:sz="4"/>
               <w:left w:val="single" w:color="BFC7D1" w:sz="4"/>
@@ -19509,7 +19542,7 @@
         </w:tc>
         <w:tc>
           <w:tcPr>
-            <w:tcW w:type="dxa" w:w="3670"/>
+            <w:tcW w:type="dxa" w:w="3510"/>
             <w:tcBorders>
               <w:top w:val="single" w:color="BFC7D1" w:sz="4"/>
               <w:left w:val="single" w:color="BFC7D1" w:sz="4"/>
@@ -19567,7 +19600,7 @@
         </w:trPr>
         <w:tc>
           <w:tcPr>
-            <w:tcW w:type="dxa" w:w="2019"/>
+            <w:tcW w:type="dxa" w:w="2340"/>
             <w:tcBorders>
               <w:top w:val="single" w:color="BFC7D1" w:sz="4"/>
               <w:left w:val="single" w:color="BFC7D1" w:sz="4"/>
@@ -19594,63 +19627,93 @@
               </w:rPr>
               <w:t xml:space="preserve">1 Media + Products + Showcase</w:t>
             </w:r>
-          </w:p>
-        </w:tc>
-        <w:tc>
-          <w:tcPr>
-            <w:tcW w:type="dxa" w:w="3671"/>
-            <w:tcBorders>
-              <w:top w:val="single" w:color="BFC7D1" w:sz="4"/>
-              <w:left w:val="single" w:color="BFC7D1" w:sz="4"/>
-              <w:bottom w:val="single" w:color="BFC7D1" w:sz="4"/>
-              <w:right w:val="single" w:color="BFC7D1" w:sz="4"/>
-            </w:tcBorders>
-            <w:tcMar>
-              <w:top w:type="dxa" w:w="60"/>
-              <w:left w:type="dxa" w:w="90"/>
-              <w:bottom w:type="dxa" w:w="60"/>
-              <w:right w:type="dxa" w:w="90"/>
-            </w:tcMar>
-          </w:tcPr>
-          <w:p>
-            <w:pPr>
-              <w:spacing w:after="0" w:line="252"/>
-            </w:pPr>
-            <w:r>
-              <w:rPr>
-                <w:sz w:val="18"/>
-                <w:szCs w:val="18"/>
-              </w:rPr>
-              <w:t xml:space="preserve">MM, PT, PS, MP (universal player, Plyr, Video.js), playback sessions, AC skeleton</w:t>
-            </w:r>
-          </w:p>
-        </w:tc>
-        <w:tc>
-          <w:tcPr>
-            <w:tcW w:type="dxa" w:w="3670"/>
-            <w:tcBorders>
-              <w:top w:val="single" w:color="BFC7D1" w:sz="4"/>
-              <w:left w:val="single" w:color="BFC7D1" w:sz="4"/>
-              <w:bottom w:val="single" w:color="BFC7D1" w:sz="4"/>
-              <w:right w:val="single" w:color="BFC7D1" w:sz="4"/>
-            </w:tcBorders>
-            <w:tcMar>
-              <w:top w:type="dxa" w:w="60"/>
-              <w:left w:type="dxa" w:w="90"/>
-              <w:bottom w:type="dxa" w:w="60"/>
-              <w:right w:type="dxa" w:w="90"/>
-            </w:tcMar>
-          </w:tcPr>
-          <w:p>
-            <w:pPr>
-              <w:spacing w:after="0" w:line="252"/>
-            </w:pPr>
-            <w:r>
-              <w:rPr>
-                <w:sz w:val="18"/>
-                <w:szCs w:val="18"/>
-              </w:rPr>
-              <w:t xml:space="preserve">upload media, publish a video product, see it in a WordPress and a Joomla page, play it after a manual grant</w:t>
+            <w:r>
+              <w:rPr>
+                <w:sz w:val="18"/>
+                <w:szCs w:val="18"/>
+              </w:rPr>
+              <w:t xml:space="preserve"> (done)</w:t>
+            </w:r>
+          </w:p>
+        </w:tc>
+        <w:tc>
+          <w:tcPr>
+            <w:tcW w:type="dxa" w:w="3510"/>
+            <w:tcBorders>
+              <w:top w:val="single" w:color="BFC7D1" w:sz="4"/>
+              <w:left w:val="single" w:color="BFC7D1" w:sz="4"/>
+              <w:bottom w:val="single" w:color="BFC7D1" w:sz="4"/>
+              <w:right w:val="single" w:color="BFC7D1" w:sz="4"/>
+            </w:tcBorders>
+            <w:tcMar>
+              <w:top w:type="dxa" w:w="60"/>
+              <w:left w:type="dxa" w:w="90"/>
+              <w:bottom w:type="dxa" w:w="60"/>
+              <w:right w:type="dxa" w:w="90"/>
+            </w:tcMar>
+          </w:tcPr>
+          <w:p>
+            <w:pPr>
+              <w:spacing w:after="0" w:line="252"/>
+            </w:pPr>
+            <w:r>
+              <w:rPr>
+                <w:sz w:val="18"/>
+                <w:szCs w:val="18"/>
+              </w:rPr>
+              <w:t xml:space="preserve">MM (uploads with validation, public/private storage, thumbnails natively and via ffmpeg, search, metadata), PT (ten types with per-type settings, categories), PS (search, filters, sort, featured, paging, grid/list, category menu, product page, ratings, views), MP (</w:t>
+            </w:r>
+            <w:r>
+              <w:rPr>
+                <w:rFonts w:ascii="Consolas" w:cs="Consolas" w:eastAsia="Consolas" w:hAnsi="Consolas"/>
+                <w:sz w:val="18"/>
+                <w:szCs w:val="18"/>
+              </w:rPr>
+              <w:t xml:space="preserve">&lt;mms-player&gt;</w:t>
+            </w:r>
+            <w:r>
+              <w:rPr>
+                <w:sz w:val="18"/>
+                <w:szCs w:val="18"/>
+              </w:rPr>
+              <w:t xml:space="preserve"> with native, Plyr and Video.js, Level 1 watermark overlay, playback sessions), signed range-capable delivery, customers with manual grants, customer login and registration, My Media, job worker</w:t>
+            </w:r>
+          </w:p>
+        </w:tc>
+        <w:tc>
+          <w:tcPr>
+            <w:tcW w:type="dxa" w:w="3510"/>
+            <w:tcBorders>
+              <w:top w:val="single" w:color="BFC7D1" w:sz="4"/>
+              <w:left w:val="single" w:color="BFC7D1" w:sz="4"/>
+              <w:bottom w:val="single" w:color="BFC7D1" w:sz="4"/>
+              <w:right w:val="single" w:color="BFC7D1" w:sz="4"/>
+            </w:tcBorders>
+            <w:tcMar>
+              <w:top w:type="dxa" w:w="60"/>
+              <w:left w:type="dxa" w:w="90"/>
+              <w:bottom w:type="dxa" w:w="60"/>
+              <w:right w:type="dxa" w:w="90"/>
+            </w:tcMar>
+          </w:tcPr>
+          <w:p>
+            <w:pPr>
+              <w:spacing w:after="0" w:line="252"/>
+            </w:pPr>
+            <w:r>
+              <w:rPr>
+                <w:rFonts w:ascii="Consolas" w:cs="Consolas" w:eastAsia="Consolas" w:hAnsi="Consolas"/>
+                <w:sz w:val="18"/>
+                <w:szCs w:val="18"/>
+              </w:rPr>
+              <w:t xml:space="preserve">cargo test</w:t>
+            </w:r>
+            <w:r>
+              <w:rPr>
+                <w:sz w:val="18"/>
+                <w:szCs w:val="18"/>
+              </w:rPr>
+              <w:t xml:space="preserve"> green including the end-to-end flow; contract test uploads through the PHP proxy; a video product uploaded in the admin plays in a WordPress and a Joomla page after a manual grant</w:t>
             </w:r>
           </w:p>
         </w:tc>
@@ -19662,7 +19725,7 @@
         </w:trPr>
         <w:tc>
           <w:tcPr>
-            <w:tcW w:type="dxa" w:w="2019"/>
+            <w:tcW w:type="dxa" w:w="2340"/>
             <w:tcBorders>
               <w:top w:val="single" w:color="BFC7D1" w:sz="4"/>
               <w:left w:val="single" w:color="BFC7D1" w:sz="4"/>
@@ -19693,7 +19756,7 @@
         </w:tc>
         <w:tc>
           <w:tcPr>
-            <w:tcW w:type="dxa" w:w="3671"/>
+            <w:tcW w:type="dxa" w:w="3510"/>
             <w:tcBorders>
               <w:top w:val="single" w:color="BFC7D1" w:sz="4"/>
               <w:left w:val="single" w:color="BFC7D1" w:sz="4"/>
@@ -19722,7 +19785,7 @@
         </w:tc>
         <w:tc>
           <w:tcPr>
-            <w:tcW w:type="dxa" w:w="3670"/>
+            <w:tcW w:type="dxa" w:w="3510"/>
             <w:tcBorders>
               <w:top w:val="single" w:color="BFC7D1" w:sz="4"/>
               <w:left w:val="single" w:color="BFC7D1" w:sz="4"/>
@@ -19757,7 +19820,7 @@
         </w:trPr>
         <w:tc>
           <w:tcPr>
-            <w:tcW w:type="dxa" w:w="2019"/>
+            <w:tcW w:type="dxa" w:w="2340"/>
             <w:tcBorders>
               <w:top w:val="single" w:color="BFC7D1" w:sz="4"/>
               <w:left w:val="single" w:color="BFC7D1" w:sz="4"/>
@@ -19788,7 +19851,7 @@
         </w:tc>
         <w:tc>
           <w:tcPr>
-            <w:tcW w:type="dxa" w:w="3671"/>
+            <w:tcW w:type="dxa" w:w="3510"/>
             <w:tcBorders>
               <w:top w:val="single" w:color="BFC7D1" w:sz="4"/>
               <w:left w:val="single" w:color="BFC7D1" w:sz="4"/>
@@ -19817,7 +19880,7 @@
         </w:tc>
         <w:tc>
           <w:tcPr>
-            <w:tcW w:type="dxa" w:w="3670"/>
+            <w:tcW w:type="dxa" w:w="3510"/>
             <w:tcBorders>
               <w:top w:val="single" w:color="BFC7D1" w:sz="4"/>
               <w:left w:val="single" w:color="BFC7D1" w:sz="4"/>
@@ -19852,7 +19915,7 @@
         </w:trPr>
         <w:tc>
           <w:tcPr>
-            <w:tcW w:type="dxa" w:w="2019"/>
+            <w:tcW w:type="dxa" w:w="2340"/>
             <w:tcBorders>
               <w:top w:val="single" w:color="BFC7D1" w:sz="4"/>
               <w:left w:val="single" w:color="BFC7D1" w:sz="4"/>
@@ -19883,7 +19946,7 @@
         </w:tc>
         <w:tc>
           <w:tcPr>
-            <w:tcW w:type="dxa" w:w="3671"/>
+            <w:tcW w:type="dxa" w:w="3510"/>
             <w:tcBorders>
               <w:top w:val="single" w:color="BFC7D1" w:sz="4"/>
               <w:left w:val="single" w:color="BFC7D1" w:sz="4"/>
@@ -19912,7 +19975,7 @@
         </w:tc>
         <w:tc>
           <w:tcPr>
-            <w:tcW w:type="dxa" w:w="3670"/>
+            <w:tcW w:type="dxa" w:w="3510"/>
             <w:tcBorders>
               <w:top w:val="single" w:color="BFC7D1" w:sz="4"/>
               <w:left w:val="single" w:color="BFC7D1" w:sz="4"/>
@@ -19947,7 +20010,7 @@
         </w:trPr>
         <w:tc>
           <w:tcPr>
-            <w:tcW w:type="dxa" w:w="2019"/>
+            <w:tcW w:type="dxa" w:w="2340"/>
             <w:tcBorders>
               <w:top w:val="single" w:color="BFC7D1" w:sz="4"/>
               <w:left w:val="single" w:color="BFC7D1" w:sz="4"/>
@@ -19978,7 +20041,7 @@
         </w:tc>
         <w:tc>
           <w:tcPr>
-            <w:tcW w:type="dxa" w:w="3671"/>
+            <w:tcW w:type="dxa" w:w="3510"/>
             <w:tcBorders>
               <w:top w:val="single" w:color="BFC7D1" w:sz="4"/>
               <w:left w:val="single" w:color="BFC7D1" w:sz="4"/>
@@ -20007,7 +20070,7 @@
         </w:tc>
         <w:tc>
           <w:tcPr>
-            <w:tcW w:type="dxa" w:w="3670"/>
+            <w:tcW w:type="dxa" w:w="3510"/>
             <w:tcBorders>
               <w:top w:val="single" w:color="BFC7D1" w:sz="4"/>
               <w:left w:val="single" w:color="BFC7D1" w:sz="4"/>
@@ -20042,7 +20105,7 @@
         </w:trPr>
         <w:tc>
           <w:tcPr>
-            <w:tcW w:type="dxa" w:w="2019"/>
+            <w:tcW w:type="dxa" w:w="2340"/>
             <w:tcBorders>
               <w:top w:val="single" w:color="BFC7D1" w:sz="4"/>
               <w:left w:val="single" w:color="BFC7D1" w:sz="4"/>
@@ -20073,7 +20136,7 @@
         </w:tc>
         <w:tc>
           <w:tcPr>
-            <w:tcW w:type="dxa" w:w="3671"/>
+            <w:tcW w:type="dxa" w:w="3510"/>
             <w:tcBorders>
               <w:top w:val="single" w:color="BFC7D1" w:sz="4"/>
               <w:left w:val="single" w:color="BFC7D1" w:sz="4"/>
@@ -20102,7 +20165,7 @@
         </w:tc>
         <w:tc>
           <w:tcPr>
-            <w:tcW w:type="dxa" w:w="3670"/>
+            <w:tcW w:type="dxa" w:w="3510"/>
             <w:tcBorders>
               <w:top w:val="single" w:color="BFC7D1" w:sz="4"/>
               <w:left w:val="single" w:color="BFC7D1" w:sz="4"/>
@@ -20137,7 +20200,7 @@
         </w:trPr>
         <w:tc>
           <w:tcPr>
-            <w:tcW w:type="dxa" w:w="2019"/>
+            <w:tcW w:type="dxa" w:w="2340"/>
             <w:tcBorders>
               <w:top w:val="single" w:color="BFC7D1" w:sz="4"/>
               <w:left w:val="single" w:color="BFC7D1" w:sz="4"/>
@@ -20168,7 +20231,7 @@
         </w:tc>
         <w:tc>
           <w:tcPr>
-            <w:tcW w:type="dxa" w:w="3671"/>
+            <w:tcW w:type="dxa" w:w="3510"/>
             <w:tcBorders>
               <w:top w:val="single" w:color="BFC7D1" w:sz="4"/>
               <w:left w:val="single" w:color="BFC7D1" w:sz="4"/>
@@ -20197,7 +20260,7 @@
         </w:tc>
         <w:tc>
           <w:tcPr>
-            <w:tcW w:type="dxa" w:w="3670"/>
+            <w:tcW w:type="dxa" w:w="3510"/>
             <w:tcBorders>
               <w:top w:val="single" w:color="BFC7D1" w:sz="4"/>
               <w:left w:val="single" w:color="BFC7D1" w:sz="4"/>

</xml_diff>